<commit_message>
Adding instructions, deleting old files
</commit_message>
<xml_diff>
--- a/RRWM/Codebook.docx
+++ b/RRWM/Codebook.docx
@@ -2,6 +2,35 @@
 <file path=word/document.xml><?xml version="1.0" encoding="utf-8"?>
 <w:document xmlns:wpc="http://schemas.microsoft.com/office/word/2010/wordprocessingCanvas" xmlns:cx="http://schemas.microsoft.com/office/drawing/2014/chartex" xmlns:cx1="http://schemas.microsoft.com/office/drawing/2015/9/8/chartex" xmlns:cx2="http://schemas.microsoft.com/office/drawing/2015/10/21/chartex" xmlns:cx3="http://schemas.microsoft.com/office/drawing/2016/5/9/chartex" xmlns:cx4="http://schemas.microsoft.com/office/drawing/2016/5/10/chartex" xmlns:cx5="http://schemas.microsoft.com/office/drawing/2016/5/11/chartex" xmlns:cx6="http://schemas.microsoft.com/office/drawing/2016/5/12/chartex" xmlns:cx7="http://schemas.microsoft.com/office/drawing/2016/5/13/chartex" xmlns:cx8="http://schemas.microsoft.com/office/drawing/2016/5/14/chartex" xmlns:mc="http://schemas.openxmlformats.org/markup-compatibility/2006" xmlns:aink="http://schemas.microsoft.com/office/drawing/2016/ink" xmlns:am3d="http://schemas.microsoft.com/office/drawing/2017/model3d" xmlns:o="urn:schemas-microsoft-com:office:office" xmlns:oel="http://schemas.microsoft.com/office/2019/extlst" xmlns:r="http://schemas.openxmlformats.org/officeDocument/2006/relationships" xmlns:m="http://schemas.openxmlformats.org/officeDocument/2006/math" xmlns:v="urn:schemas-microsoft-com:vml" xmlns:wp14="http://schemas.microsoft.com/office/word/2010/wordprocessingDrawing" xmlns:wp="http://schemas.openxmlformats.org/drawingml/2006/wordprocessingDrawing" xmlns:w10="urn:schemas-microsoft-com:office:word" xmlns:w="http://schemas.openxmlformats.org/wordprocessingml/2006/main" xmlns:w14="http://schemas.microsoft.com/office/word/2010/wordml" xmlns:w15="http://schemas.microsoft.com/office/word/2012/wordml" xmlns:w16cex="http://schemas.microsoft.com/office/word/2018/wordml/cex" xmlns:w16cid="http://schemas.microsoft.com/office/word/2016/wordml/cid" xmlns:w16="http://schemas.microsoft.com/office/word/2018/wordml" xmlns:w16du="http://schemas.microsoft.com/office/word/2023/wordml/word16du" xmlns:w16sdtdh="http://schemas.microsoft.com/office/word/2020/wordml/sdtdatahash" xmlns:w16sdtfl="http://schemas.microsoft.com/office/word/2024/wordml/sdtformatlock" xmlns:w16se="http://schemas.microsoft.com/office/word/2015/wordml/symex" xmlns:wpg="http://schemas.microsoft.com/office/word/2010/wordprocessingGroup" xmlns:wpi="http://schemas.microsoft.com/office/word/2010/wordprocessingInk" xmlns:wne="http://schemas.microsoft.com/office/word/2006/wordml" xmlns:wps="http://schemas.microsoft.com/office/word/2010/wordprocessingShape" mc:Ignorable="w14 w15 w16se w16cid w16 w16cex w16sdtdh w16sdtfl w16du wp14">
   <w:body>
+    <w:p>
+      <w:pPr>
+        <w:tabs>
+          <w:tab w:val="num" w:pos="720"/>
+        </w:tabs>
+        <w:ind w:left="-357"/>
+        <w:textAlignment w:val="baseline"/>
+        <w:outlineLvl w:val="0"/>
+      </w:pPr>
+      <w:r>
+        <w:t>Software: R &amp; R Studio (</w:t>
+      </w:r>
+      <w:r>
+        <w:t>Version 2025.08.0+357 (2025.08.0+357)</w:t>
+      </w:r>
+      <w:r>
+        <w:t>)</w:t>
+      </w:r>
+    </w:p>
+    <w:p>
+      <w:pPr>
+        <w:tabs>
+          <w:tab w:val="num" w:pos="720"/>
+        </w:tabs>
+        <w:ind w:left="-357"/>
+        <w:textAlignment w:val="baseline"/>
+        <w:outlineLvl w:val="0"/>
+      </w:pPr>
+    </w:p>
     <w:p>
       <w:pPr>
         <w:tabs>
@@ -158,52 +187,180 @@
     </w:p>
     <w:p>
       <w:pPr>
-        <w:ind w:left="425"/>
+        <w:pStyle w:val="NormalWeb"/>
+        <w:numPr>
+          <w:ilvl w:val="0"/>
+          <w:numId w:val="7"/>
+        </w:numPr>
+        <w:spacing w:before="0" w:beforeAutospacing="0" w:after="0" w:afterAutospacing="0"/>
         <w:textAlignment w:val="baseline"/>
         <w:rPr>
-          <w:rFonts w:eastAsia="Times New Roman"/>
           <w:color w:val="000000"/>
-          <w:kern w:val="0"/>
-          <w:szCs w:val="24"/>
-          <w14:ligatures w14:val="none"/>
         </w:rPr>
       </w:pPr>
       <w:r>
         <w:rPr>
-          <w:rFonts w:eastAsia="Times New Roman"/>
           <w:color w:val="000000"/>
-          <w:kern w:val="0"/>
-          <w:szCs w:val="24"/>
-          <w14:ligatures w14:val="none"/>
-        </w:rPr>
-        <w:t>This dataset is an preliminary study of housing ownership across census metropolitan areas across Canada.</w:t>
+        </w:rPr>
+        <w:t>This dataset is a preliminary study of housing ownership across census metropolitan areas across Canada.</w:t>
       </w:r>
     </w:p>
     <w:p>
       <w:pPr>
-        <w:ind w:left="425"/>
+        <w:pStyle w:val="NormalWeb"/>
+        <w:numPr>
+          <w:ilvl w:val="0"/>
+          <w:numId w:val="7"/>
+        </w:numPr>
+        <w:spacing w:before="0" w:beforeAutospacing="0" w:after="0" w:afterAutospacing="0"/>
         <w:textAlignment w:val="baseline"/>
         <w:rPr>
-          <w:rFonts w:eastAsia="Times New Roman"/>
-          <w:b/>
-          <w:bCs/>
-          <w:color w:val="000000"/>
-          <w:kern w:val="0"/>
-          <w:szCs w:val="24"/>
-          <w14:ligatures w14:val="none"/>
-        </w:rPr>
-      </w:pPr>
-      <w:r>
-        <w:rPr>
-          <w:rFonts w:eastAsia="Times New Roman"/>
           <w:b/>
           <w:bCs/>
           <w:color w:val="FF0000"/>
-          <w:kern w:val="0"/>
-          <w:szCs w:val="24"/>
-          <w14:ligatures w14:val="none"/>
+        </w:rPr>
+      </w:pPr>
+      <w:r>
+        <w:rPr>
+          <w:b/>
+          <w:bCs/>
+          <w:color w:val="FF0000"/>
         </w:rPr>
         <w:t>Weights are not used in this version of analysis</w:t>
+      </w:r>
+    </w:p>
+    <w:p>
+      <w:pPr>
+        <w:pStyle w:val="NormalWeb"/>
+        <w:numPr>
+          <w:ilvl w:val="0"/>
+          <w:numId w:val="7"/>
+        </w:numPr>
+        <w:spacing w:before="0" w:beforeAutospacing="0" w:after="0" w:afterAutospacing="0"/>
+        <w:textAlignment w:val="baseline"/>
+        <w:rPr>
+          <w:color w:val="000000"/>
+        </w:rPr>
+      </w:pPr>
+      <w:r>
+        <w:rPr>
+          <w:color w:val="000000"/>
+        </w:rPr>
+        <w:t xml:space="preserve">Since people with a mortgage are entitled with housing tenure (at least during the period of investigation), the analytical dataset should be separated into two independent </w:t>
+      </w:r>
+      <w:proofErr w:type="gramStart"/>
+      <w:r>
+        <w:rPr>
+          <w:color w:val="000000"/>
+        </w:rPr>
+        <w:t>dataset</w:t>
+      </w:r>
+      <w:proofErr w:type="gramEnd"/>
+      <w:r>
+        <w:rPr>
+          <w:color w:val="000000"/>
+        </w:rPr>
+        <w:t xml:space="preserve"> with one using tenure as the outcome variable and the other using mortgage as the outcome variable.</w:t>
+      </w:r>
+    </w:p>
+    <w:p>
+      <w:pPr>
+        <w:pStyle w:val="NormalWeb"/>
+        <w:numPr>
+          <w:ilvl w:val="1"/>
+          <w:numId w:val="8"/>
+        </w:numPr>
+        <w:spacing w:before="0" w:beforeAutospacing="0" w:after="0" w:afterAutospacing="0"/>
+        <w:textAlignment w:val="baseline"/>
+        <w:rPr>
+          <w:color w:val="000000"/>
+        </w:rPr>
+      </w:pPr>
+      <w:r>
+        <w:rPr>
+          <w:color w:val="000000"/>
+        </w:rPr>
+        <w:t xml:space="preserve">First, filter samples where </w:t>
+      </w:r>
+      <w:r>
+        <w:rPr>
+          <w:color w:val="0070C0"/>
+        </w:rPr>
+        <w:t>tenure</w:t>
+      </w:r>
+      <w:r>
+        <w:rPr>
+          <w:color w:val="000000"/>
+        </w:rPr>
+        <w:t xml:space="preserve">=1 into a separate dataset and construct a separate dataset </w:t>
+      </w:r>
+      <w:proofErr w:type="spellStart"/>
+      <w:r>
+        <w:rPr>
+          <w:color w:val="0070C0"/>
+        </w:rPr>
+        <w:t>df_mortgage</w:t>
+      </w:r>
+      <w:proofErr w:type="spellEnd"/>
+      <w:r>
+        <w:rPr>
+          <w:color w:val="000000"/>
+        </w:rPr>
+        <w:t xml:space="preserve">; and then generated another new dataset named as </w:t>
+      </w:r>
+      <w:proofErr w:type="spellStart"/>
+      <w:r>
+        <w:rPr>
+          <w:color w:val="0070C0"/>
+        </w:rPr>
+        <w:t>df_tenure</w:t>
+      </w:r>
+      <w:proofErr w:type="spellEnd"/>
+      <w:r>
+        <w:rPr>
+          <w:color w:val="000000"/>
+        </w:rPr>
+        <w:t> </w:t>
+      </w:r>
+    </w:p>
+    <w:p>
+      <w:pPr>
+        <w:pStyle w:val="NormalWeb"/>
+        <w:numPr>
+          <w:ilvl w:val="1"/>
+          <w:numId w:val="9"/>
+        </w:numPr>
+        <w:spacing w:before="0" w:beforeAutospacing="0" w:after="0" w:afterAutospacing="0"/>
+        <w:textAlignment w:val="baseline"/>
+        <w:rPr>
+          <w:color w:val="000000"/>
+        </w:rPr>
+      </w:pPr>
+      <w:r>
+        <w:rPr>
+          <w:color w:val="000000"/>
+        </w:rPr>
+        <w:t>Secondly, list-wise delete observations with missing values in outcome variables and other independent variables, separately in these two datasets</w:t>
+      </w:r>
+    </w:p>
+    <w:p>
+      <w:pPr>
+        <w:pStyle w:val="NormalWeb"/>
+        <w:numPr>
+          <w:ilvl w:val="1"/>
+          <w:numId w:val="10"/>
+        </w:numPr>
+        <w:spacing w:before="0" w:beforeAutospacing="0" w:after="0" w:afterAutospacing="0"/>
+        <w:textAlignment w:val="baseline"/>
+        <w:rPr>
+          <w:color w:val="000000"/>
+        </w:rPr>
+      </w:pPr>
+      <w:r>
+        <w:rPr>
+          <w:color w:val="000000"/>
+        </w:rPr>
+        <w:t>Then proceed to analysis</w:t>
       </w:r>
     </w:p>
     <w:p>
@@ -513,6 +670,16 @@
         </w:rPr>
         <w:t>-year interval</w:t>
       </w:r>
+      <w:r>
+        <w:rPr>
+          <w:rFonts w:eastAsia="Times New Roman"/>
+          <w:color w:val="000000"/>
+          <w:kern w:val="0"/>
+          <w:szCs w:val="24"/>
+          <w14:ligatures w14:val="none"/>
+        </w:rPr>
+        <w:t xml:space="preserve"> and samples are 15+ years old</w:t>
+      </w:r>
     </w:p>
     <w:p>
       <w:pPr>
@@ -584,6 +751,7 @@
         </w:rPr>
         <w:t xml:space="preserve">Variable name: </w:t>
       </w:r>
+      <w:proofErr w:type="spellStart"/>
       <w:r>
         <w:rPr>
           <w:rFonts w:eastAsia="Times New Roman"/>
@@ -594,6 +762,7 @@
         </w:rPr>
         <w:t>MarStH</w:t>
       </w:r>
+      <w:proofErr w:type="spellEnd"/>
     </w:p>
     <w:p>
       <w:pPr>
@@ -1207,6 +1376,7 @@
                 <w:szCs w:val="24"/>
                 <w14:ligatures w14:val="none"/>
               </w:rPr>
+              <w:lastRenderedPageBreak/>
               <w:t>4</w:t>
             </w:r>
           </w:p>
@@ -1605,7 +1775,7 @@
           <w:szCs w:val="24"/>
           <w14:ligatures w14:val="none"/>
         </w:rPr>
-        <w:t>:</w:t>
+        <w:t xml:space="preserve">: </w:t>
       </w:r>
       <w:r>
         <w:rPr>
@@ -1613,10 +1783,19 @@
           <w:color w:val="000000"/>
           <w:kern w:val="0"/>
           <w:szCs w:val="24"/>
-          <w:u w:val="single"/>
           <w14:ligatures w14:val="none"/>
         </w:rPr>
-        <w:t xml:space="preserve"> </w:t>
+        <w:t xml:space="preserve">(1, 4, 5, 6) are coded as 0, representing single living, and (2, 3) are coded as </w:t>
+      </w:r>
+      <w:r>
+        <w:rPr>
+          <w:rFonts w:eastAsia="Times New Roman"/>
+          <w:color w:val="000000"/>
+          <w:kern w:val="0"/>
+          <w:szCs w:val="24"/>
+          <w14:ligatures w14:val="none"/>
+        </w:rPr>
+        <w:t>1, representing married or common law</w:t>
       </w:r>
     </w:p>
     <w:p>
@@ -1794,7 +1973,6 @@
                 <w:szCs w:val="24"/>
                 <w14:ligatures w14:val="none"/>
               </w:rPr>
-              <w:lastRenderedPageBreak/>
               <w:t>Value</w:t>
             </w:r>
           </w:p>
@@ -2164,7 +2342,7 @@
         <w:ind w:left="360"/>
         <w:rPr>
           <w:rFonts w:eastAsia="Times New Roman"/>
-          <w:color w:val="000000"/>
+          <w:color w:val="000000" w:themeColor="text1"/>
           <w:kern w:val="0"/>
           <w:szCs w:val="24"/>
           <w14:ligatures w14:val="none"/>
@@ -2180,6 +2358,7 @@
         </w:rPr>
         <w:t xml:space="preserve">Recoded as: </w:t>
       </w:r>
+      <w:proofErr w:type="gramStart"/>
       <w:r>
         <w:rPr>
           <w:rFonts w:eastAsia="Times New Roman"/>
@@ -2189,6 +2368,37 @@
           <w14:ligatures w14:val="none"/>
         </w:rPr>
         <w:t>female</w:t>
+      </w:r>
+      <w:r>
+        <w:rPr>
+          <w:rFonts w:eastAsia="Times New Roman"/>
+          <w:color w:val="0070C0"/>
+          <w:kern w:val="0"/>
+          <w:szCs w:val="24"/>
+          <w14:ligatures w14:val="none"/>
+        </w:rPr>
+        <w:t xml:space="preserve"> </w:t>
+      </w:r>
+      <w:r>
+        <w:rPr>
+          <w:rFonts w:eastAsia="Times New Roman"/>
+          <w:color w:val="000000" w:themeColor="text1"/>
+          <w:kern w:val="0"/>
+          <w:szCs w:val="24"/>
+          <w14:ligatures w14:val="none"/>
+        </w:rPr>
+        <w:t>,</w:t>
+      </w:r>
+      <w:proofErr w:type="gramEnd"/>
+      <w:r>
+        <w:rPr>
+          <w:rFonts w:eastAsia="Times New Roman"/>
+          <w:color w:val="000000" w:themeColor="text1"/>
+          <w:kern w:val="0"/>
+          <w:szCs w:val="24"/>
+          <w14:ligatures w14:val="none"/>
+        </w:rPr>
+        <w:t xml:space="preserve"> female =1, male =0</w:t>
       </w:r>
     </w:p>
     <w:p>
@@ -2336,7 +2546,29 @@
           <w:szCs w:val="24"/>
           <w14:ligatures w14:val="none"/>
         </w:rPr>
-        <w:t>Original coding: continuous variable. The value 88,888,888 stands for not available. The value 99,999,999 stands for not applicable and is applied to all persons aged less than 15 years. Otherwise, this variable could be positive, negative or zero and is a rounded value of the amount received by the individual in 2015. Values that would have been rounded to zero have been replaced by 1. In some cases, high values have been top coded and low values have been bottom coded in this file.</w:t>
+        <w:t xml:space="preserve">Original coding: continuous variable. The value 88,888,888 stands for not available. The value 99,999,999 stands for not applicable and is applied to all persons aged less than 15 years. Otherwise, this variable could be positive, negative or zero and is a rounded value of the amount received by the individual in 2015. Values that would have been rounded to zero have been replaced by 1. In some cases, high values have been top coded and low values have been </w:t>
+      </w:r>
+      <w:proofErr w:type="gramStart"/>
+      <w:r>
+        <w:rPr>
+          <w:rFonts w:eastAsia="Times New Roman"/>
+          <w:color w:val="000000"/>
+          <w:kern w:val="0"/>
+          <w:szCs w:val="24"/>
+          <w14:ligatures w14:val="none"/>
+        </w:rPr>
+        <w:t>bottom</w:t>
+      </w:r>
+      <w:proofErr w:type="gramEnd"/>
+      <w:r>
+        <w:rPr>
+          <w:rFonts w:eastAsia="Times New Roman"/>
+          <w:color w:val="000000"/>
+          <w:kern w:val="0"/>
+          <w:szCs w:val="24"/>
+          <w14:ligatures w14:val="none"/>
+        </w:rPr>
+        <w:t xml:space="preserve"> coded in this file.</w:t>
       </w:r>
     </w:p>
     <w:p>
@@ -2372,6 +2604,7 @@
         </w:rPr>
         <w:t xml:space="preserve">Recoded as: </w:t>
       </w:r>
+      <w:proofErr w:type="spellStart"/>
       <w:r>
         <w:rPr>
           <w:rFonts w:eastAsia="Times New Roman"/>
@@ -2382,6 +2615,7 @@
         </w:rPr>
         <w:t>income_q</w:t>
       </w:r>
+      <w:proofErr w:type="spellEnd"/>
     </w:p>
     <w:p>
       <w:pPr>
@@ -2472,6 +2706,7 @@
         </w:rPr>
         <w:t xml:space="preserve">Variable name: </w:t>
       </w:r>
+      <w:proofErr w:type="spellStart"/>
       <w:r>
         <w:rPr>
           <w:rFonts w:eastAsia="Times New Roman"/>
@@ -2482,6 +2717,7 @@
         </w:rPr>
         <w:t>PresMortG</w:t>
       </w:r>
+      <w:proofErr w:type="spellEnd"/>
     </w:p>
     <w:p>
       <w:pPr>
@@ -3237,7 +3473,7 @@
         <w:ind w:left="360"/>
         <w:rPr>
           <w:rFonts w:eastAsia="Times New Roman"/>
-          <w:color w:val="auto"/>
+          <w:color w:val="000000" w:themeColor="text1"/>
           <w:kern w:val="0"/>
           <w:szCs w:val="24"/>
           <w14:ligatures w14:val="none"/>
@@ -3262,6 +3498,16 @@
           <w14:ligatures w14:val="none"/>
         </w:rPr>
         <w:t>mortgage</w:t>
+      </w:r>
+      <w:r>
+        <w:rPr>
+          <w:rFonts w:eastAsia="Times New Roman"/>
+          <w:color w:val="000000" w:themeColor="text1"/>
+          <w:kern w:val="0"/>
+          <w:szCs w:val="24"/>
+          <w14:ligatures w14:val="none"/>
+        </w:rPr>
+        <w:t>, where 1=with mortgage and 0=without mortgage</w:t>
       </w:r>
     </w:p>
     <w:p>
@@ -3321,6 +3567,7 @@
         </w:rPr>
         <w:t xml:space="preserve">Variable name: </w:t>
       </w:r>
+      <w:proofErr w:type="spellStart"/>
       <w:r>
         <w:rPr>
           <w:rFonts w:eastAsia="Times New Roman"/>
@@ -3331,6 +3578,7 @@
         </w:rPr>
         <w:t>Tenur</w:t>
       </w:r>
+      <w:proofErr w:type="spellEnd"/>
     </w:p>
     <w:p>
       <w:pPr>
@@ -3363,7 +3611,6 @@
           <w:szCs w:val="24"/>
           <w14:ligatures w14:val="none"/>
         </w:rPr>
-        <w:lastRenderedPageBreak/>
         <w:t>Def: Refers to whether the household owns or rents their private dwelling. The private dwelling may be situated on rented or leased land or be part of a condominium.</w:t>
       </w:r>
     </w:p>
@@ -4049,7 +4296,17 @@
           <w:szCs w:val="24"/>
           <w14:ligatures w14:val="none"/>
         </w:rPr>
-        <w:t>Def: This variable refers to whether a person attended, either full-time or part-time, any accredited educational institution or program at any time during the nine-month period between September 2015 and May 10, 2016. The person may have attended more than one educational institution or have been enrolled in more than one program; Population aged 15 years and over in private households</w:t>
+        <w:t>Def: </w:t>
+      </w:r>
+      <w:r>
+        <w:rPr>
+          <w:rFonts w:eastAsia="Times New Roman"/>
+          <w:color w:val="000000"/>
+          <w:kern w:val="0"/>
+          <w:szCs w:val="24"/>
+          <w14:ligatures w14:val="none"/>
+        </w:rPr>
+        <w:t>Highest certificate, diploma or degree</w:t>
       </w:r>
     </w:p>
     <w:p>
@@ -4089,7 +4346,6 @@
     <w:tbl>
       <w:tblPr>
         <w:tblW w:w="0" w:type="auto"/>
-        <w:jc w:val="center"/>
         <w:tblCellSpacing w:w="15" w:type="dxa"/>
         <w:tblBorders>
           <w:top w:val="single" w:sz="4" w:space="0" w:color="auto"/>
@@ -4109,15 +4365,15 @@
       </w:tblPr>
       <w:tblGrid>
         <w:gridCol w:w="695"/>
-        <w:gridCol w:w="5559"/>
+        <w:gridCol w:w="4624"/>
         <w:gridCol w:w="920"/>
-        <w:gridCol w:w="1355"/>
+        <w:gridCol w:w="1220"/>
+        <w:gridCol w:w="1891"/>
       </w:tblGrid>
       <w:tr>
         <w:trPr>
           <w:tblHeader/>
           <w:tblCellSpacing w:w="15" w:type="dxa"/>
-          <w:jc w:val="center"/>
         </w:trPr>
         <w:tc>
           <w:tcPr>
@@ -4252,6 +4508,40 @@
                 <w14:ligatures w14:val="none"/>
               </w:rPr>
               <w:t>Weighted</w:t>
+            </w:r>
+          </w:p>
+        </w:tc>
+        <w:tc>
+          <w:tcPr>
+            <w:tcW w:w="0" w:type="auto"/>
+            <w:vAlign w:val="center"/>
+            <w:hideMark/>
+          </w:tcPr>
+          <w:p>
+            <w:pPr>
+              <w:spacing w:before="100" w:beforeAutospacing="1" w:after="100" w:afterAutospacing="1"/>
+              <w:jc w:val="center"/>
+              <w:rPr>
+                <w:rFonts w:eastAsia="Times New Roman"/>
+                <w:b/>
+                <w:bCs/>
+                <w:color w:val="auto"/>
+                <w:kern w:val="0"/>
+                <w:szCs w:val="24"/>
+                <w14:ligatures w14:val="none"/>
+              </w:rPr>
+            </w:pPr>
+            <w:r>
+              <w:rPr>
+                <w:rFonts w:eastAsia="Times New Roman"/>
+                <w:b/>
+                <w:bCs/>
+                <w:color w:val="auto"/>
+                <w:kern w:val="0"/>
+                <w:szCs w:val="24"/>
+                <w14:ligatures w14:val="none"/>
+              </w:rPr>
+              <w:t>Percentage (Weighted)</w:t>
             </w:r>
           </w:p>
         </w:tc>
@@ -4259,7 +4549,6 @@
       <w:tr>
         <w:trPr>
           <w:tblCellSpacing w:w="15" w:type="dxa"/>
-          <w:jc w:val="center"/>
         </w:trPr>
         <w:tc>
           <w:tcPr>
@@ -4315,7 +4604,7 @@
                 <w:szCs w:val="24"/>
                 <w14:ligatures w14:val="none"/>
               </w:rPr>
-              <w:t>Did not attend school</w:t>
+              <w:t>No certificate, diploma or degree</w:t>
             </w:r>
           </w:p>
         </w:tc>
@@ -4344,7 +4633,7 @@
                 <w:szCs w:val="24"/>
                 <w14:ligatures w14:val="none"/>
               </w:rPr>
-              <w:t>647,718</w:t>
+              <w:t>141,122</w:t>
             </w:r>
           </w:p>
         </w:tc>
@@ -4373,7 +4662,36 @@
                 <w:szCs w:val="24"/>
                 <w14:ligatures w14:val="none"/>
               </w:rPr>
-              <w:t>23,989,647.6</w:t>
+              <w:t>5,226,774.0</w:t>
+            </w:r>
+          </w:p>
+        </w:tc>
+        <w:tc>
+          <w:tcPr>
+            <w:tcW w:w="0" w:type="auto"/>
+            <w:vAlign w:val="center"/>
+            <w:hideMark/>
+          </w:tcPr>
+          <w:p>
+            <w:pPr>
+              <w:spacing w:before="100" w:beforeAutospacing="1" w:after="100" w:afterAutospacing="1"/>
+              <w:rPr>
+                <w:rFonts w:eastAsia="Times New Roman"/>
+                <w:color w:val="auto"/>
+                <w:kern w:val="0"/>
+                <w:szCs w:val="24"/>
+                <w14:ligatures w14:val="none"/>
+              </w:rPr>
+            </w:pPr>
+            <w:r>
+              <w:rPr>
+                <w:rFonts w:eastAsia="Times New Roman"/>
+                <w:color w:val="auto"/>
+                <w:kern w:val="0"/>
+                <w:szCs w:val="24"/>
+                <w14:ligatures w14:val="none"/>
+              </w:rPr>
+              <w:t>18.2%</w:t>
             </w:r>
           </w:p>
         </w:tc>
@@ -4381,7 +4699,6 @@
       <w:tr>
         <w:trPr>
           <w:tblCellSpacing w:w="15" w:type="dxa"/>
-          <w:jc w:val="center"/>
         </w:trPr>
         <w:tc>
           <w:tcPr>
@@ -4437,7 +4754,7 @@
                 <w:szCs w:val="24"/>
                 <w14:ligatures w14:val="none"/>
               </w:rPr>
-              <w:t>Elementary or secondary school</w:t>
+              <w:t>Secondary (high) school diploma or equivalency certificate</w:t>
             </w:r>
           </w:p>
         </w:tc>
@@ -4466,7 +4783,7 @@
                 <w:szCs w:val="24"/>
                 <w14:ligatures w14:val="none"/>
               </w:rPr>
-              <w:t>39,978</w:t>
+              <w:t>204,645</w:t>
             </w:r>
           </w:p>
         </w:tc>
@@ -4495,7 +4812,36 @@
                 <w:szCs w:val="24"/>
                 <w14:ligatures w14:val="none"/>
               </w:rPr>
-              <w:t>1,480,657.7</w:t>
+              <w:t>7,579,423.6</w:t>
+            </w:r>
+          </w:p>
+        </w:tc>
+        <w:tc>
+          <w:tcPr>
+            <w:tcW w:w="0" w:type="auto"/>
+            <w:vAlign w:val="center"/>
+            <w:hideMark/>
+          </w:tcPr>
+          <w:p>
+            <w:pPr>
+              <w:spacing w:before="100" w:beforeAutospacing="1" w:after="100" w:afterAutospacing="1"/>
+              <w:rPr>
+                <w:rFonts w:eastAsia="Times New Roman"/>
+                <w:color w:val="auto"/>
+                <w:kern w:val="0"/>
+                <w:szCs w:val="24"/>
+                <w14:ligatures w14:val="none"/>
+              </w:rPr>
+            </w:pPr>
+            <w:r>
+              <w:rPr>
+                <w:rFonts w:eastAsia="Times New Roman"/>
+                <w:color w:val="auto"/>
+                <w:kern w:val="0"/>
+                <w:szCs w:val="24"/>
+                <w14:ligatures w14:val="none"/>
+              </w:rPr>
+              <w:t>26.5%</w:t>
             </w:r>
           </w:p>
         </w:tc>
@@ -4503,7 +4849,6 @@
       <w:tr>
         <w:trPr>
           <w:tblCellSpacing w:w="15" w:type="dxa"/>
-          <w:jc w:val="center"/>
         </w:trPr>
         <w:tc>
           <w:tcPr>
@@ -4559,7 +4904,7 @@
                 <w:szCs w:val="24"/>
                 <w14:ligatures w14:val="none"/>
               </w:rPr>
-              <w:t>Technical or trade school, community college or CEGEP</w:t>
+              <w:t>Trades certificate or diploma other than Certificate of Apprenticeship</w:t>
             </w:r>
           </w:p>
         </w:tc>
@@ -4588,7 +4933,7 @@
                 <w:szCs w:val="24"/>
                 <w14:ligatures w14:val="none"/>
               </w:rPr>
-              <w:t>38,389</w:t>
+              <w:t>41,156</w:t>
             </w:r>
           </w:p>
         </w:tc>
@@ -4617,7 +4962,36 @@
                 <w:szCs w:val="24"/>
                 <w14:ligatures w14:val="none"/>
               </w:rPr>
-              <w:t>1,421,821.8</w:t>
+              <w:t>1,524,386.6</w:t>
+            </w:r>
+          </w:p>
+        </w:tc>
+        <w:tc>
+          <w:tcPr>
+            <w:tcW w:w="0" w:type="auto"/>
+            <w:vAlign w:val="center"/>
+            <w:hideMark/>
+          </w:tcPr>
+          <w:p>
+            <w:pPr>
+              <w:spacing w:before="100" w:beforeAutospacing="1" w:after="100" w:afterAutospacing="1"/>
+              <w:rPr>
+                <w:rFonts w:eastAsia="Times New Roman"/>
+                <w:color w:val="auto"/>
+                <w:kern w:val="0"/>
+                <w:szCs w:val="24"/>
+                <w14:ligatures w14:val="none"/>
+              </w:rPr>
+            </w:pPr>
+            <w:r>
+              <w:rPr>
+                <w:rFonts w:eastAsia="Times New Roman"/>
+                <w:color w:val="auto"/>
+                <w:kern w:val="0"/>
+                <w:szCs w:val="24"/>
+                <w14:ligatures w14:val="none"/>
+              </w:rPr>
+              <w:t>5.3%</w:t>
             </w:r>
           </w:p>
         </w:tc>
@@ -4625,7 +4999,6 @@
       <w:tr>
         <w:trPr>
           <w:tblCellSpacing w:w="15" w:type="dxa"/>
-          <w:jc w:val="center"/>
         </w:trPr>
         <w:tc>
           <w:tcPr>
@@ -4681,7 +5054,7 @@
                 <w:szCs w:val="24"/>
                 <w14:ligatures w14:val="none"/>
               </w:rPr>
-              <w:t>University</w:t>
+              <w:t>Certificate of Apprenticeship or Certificate of Qualification</w:t>
             </w:r>
           </w:p>
         </w:tc>
@@ -4710,7 +5083,7 @@
                 <w:szCs w:val="24"/>
                 <w14:ligatures w14:val="none"/>
               </w:rPr>
-              <w:t>41,907</w:t>
+              <w:t>32,745</w:t>
             </w:r>
           </w:p>
         </w:tc>
@@ -4739,7 +5112,36 @@
                 <w:szCs w:val="24"/>
                 <w14:ligatures w14:val="none"/>
               </w:rPr>
-              <w:t>1,552,112.8</w:t>
+              <w:t>1,212,759.8</w:t>
+            </w:r>
+          </w:p>
+        </w:tc>
+        <w:tc>
+          <w:tcPr>
+            <w:tcW w:w="0" w:type="auto"/>
+            <w:vAlign w:val="center"/>
+            <w:hideMark/>
+          </w:tcPr>
+          <w:p>
+            <w:pPr>
+              <w:spacing w:before="100" w:beforeAutospacing="1" w:after="100" w:afterAutospacing="1"/>
+              <w:rPr>
+                <w:rFonts w:eastAsia="Times New Roman"/>
+                <w:color w:val="auto"/>
+                <w:kern w:val="0"/>
+                <w:szCs w:val="24"/>
+                <w14:ligatures w14:val="none"/>
+              </w:rPr>
+            </w:pPr>
+            <w:r>
+              <w:rPr>
+                <w:rFonts w:eastAsia="Times New Roman"/>
+                <w:color w:val="auto"/>
+                <w:kern w:val="0"/>
+                <w:szCs w:val="24"/>
+                <w14:ligatures w14:val="none"/>
+              </w:rPr>
+              <w:t>4.2%</w:t>
             </w:r>
           </w:p>
         </w:tc>
@@ -4747,7 +5149,6 @@
       <w:tr>
         <w:trPr>
           <w:tblCellSpacing w:w="15" w:type="dxa"/>
-          <w:jc w:val="center"/>
         </w:trPr>
         <w:tc>
           <w:tcPr>
@@ -4803,7 +5204,7 @@
                 <w:szCs w:val="24"/>
                 <w14:ligatures w14:val="none"/>
               </w:rPr>
-              <w:t>Multiple responses</w:t>
+              <w:t>Program of 3 months to less than 1 year (College, CEGEP, etc.)</w:t>
             </w:r>
           </w:p>
         </w:tc>
@@ -4832,7 +5233,7 @@
                 <w:szCs w:val="24"/>
                 <w14:ligatures w14:val="none"/>
               </w:rPr>
-              <w:t>1,452</w:t>
+              <w:t>24,062</w:t>
             </w:r>
           </w:p>
         </w:tc>
@@ -4861,7 +5262,36 @@
                 <w:szCs w:val="24"/>
                 <w14:ligatures w14:val="none"/>
               </w:rPr>
-              <w:t>53,778.4</w:t>
+              <w:t>891,167.9</w:t>
+            </w:r>
+          </w:p>
+        </w:tc>
+        <w:tc>
+          <w:tcPr>
+            <w:tcW w:w="0" w:type="auto"/>
+            <w:vAlign w:val="center"/>
+            <w:hideMark/>
+          </w:tcPr>
+          <w:p>
+            <w:pPr>
+              <w:spacing w:before="100" w:beforeAutospacing="1" w:after="100" w:afterAutospacing="1"/>
+              <w:rPr>
+                <w:rFonts w:eastAsia="Times New Roman"/>
+                <w:color w:val="auto"/>
+                <w:kern w:val="0"/>
+                <w:szCs w:val="24"/>
+                <w14:ligatures w14:val="none"/>
+              </w:rPr>
+            </w:pPr>
+            <w:r>
+              <w:rPr>
+                <w:rFonts w:eastAsia="Times New Roman"/>
+                <w:color w:val="auto"/>
+                <w:kern w:val="0"/>
+                <w:szCs w:val="24"/>
+                <w14:ligatures w14:val="none"/>
+              </w:rPr>
+              <w:t>3.1%</w:t>
             </w:r>
           </w:p>
         </w:tc>
@@ -4869,7 +5299,6 @@
       <w:tr>
         <w:trPr>
           <w:tblCellSpacing w:w="15" w:type="dxa"/>
-          <w:jc w:val="center"/>
         </w:trPr>
         <w:tc>
           <w:tcPr>
@@ -4896,7 +5325,8 @@
                 <w:szCs w:val="24"/>
                 <w14:ligatures w14:val="none"/>
               </w:rPr>
-              <w:t>8</w:t>
+              <w:lastRenderedPageBreak/>
+              <w:t>6</w:t>
             </w:r>
           </w:p>
         </w:tc>
@@ -4925,7 +5355,7 @@
                 <w:szCs w:val="24"/>
                 <w14:ligatures w14:val="none"/>
               </w:rPr>
-              <w:t>Not available</w:t>
+              <w:t>Program of 1 to 2 years (College, CEGEP and other non-university)</w:t>
             </w:r>
           </w:p>
         </w:tc>
@@ -4954,7 +5384,7 @@
                 <w:szCs w:val="24"/>
                 <w14:ligatures w14:val="none"/>
               </w:rPr>
-              <w:t>3,873</w:t>
+              <w:t>69,982</w:t>
             </w:r>
           </w:p>
         </w:tc>
@@ -4983,7 +5413,36 @@
                 <w:szCs w:val="24"/>
                 <w14:ligatures w14:val="none"/>
               </w:rPr>
-              <w:t>143,444.9</w:t>
+              <w:t>2,591,915.4</w:t>
+            </w:r>
+          </w:p>
+        </w:tc>
+        <w:tc>
+          <w:tcPr>
+            <w:tcW w:w="0" w:type="auto"/>
+            <w:vAlign w:val="center"/>
+            <w:hideMark/>
+          </w:tcPr>
+          <w:p>
+            <w:pPr>
+              <w:spacing w:before="100" w:beforeAutospacing="1" w:after="100" w:afterAutospacing="1"/>
+              <w:rPr>
+                <w:rFonts w:eastAsia="Times New Roman"/>
+                <w:color w:val="auto"/>
+                <w:kern w:val="0"/>
+                <w:szCs w:val="24"/>
+                <w14:ligatures w14:val="none"/>
+              </w:rPr>
+            </w:pPr>
+            <w:r>
+              <w:rPr>
+                <w:rFonts w:eastAsia="Times New Roman"/>
+                <w:color w:val="auto"/>
+                <w:kern w:val="0"/>
+                <w:szCs w:val="24"/>
+                <w14:ligatures w14:val="none"/>
+              </w:rPr>
+              <w:t>9.0%</w:t>
             </w:r>
           </w:p>
         </w:tc>
@@ -4991,7 +5450,6 @@
       <w:tr>
         <w:trPr>
           <w:tblCellSpacing w:w="15" w:type="dxa"/>
-          <w:jc w:val="center"/>
         </w:trPr>
         <w:tc>
           <w:tcPr>
@@ -5018,6 +5476,306 @@
                 <w:szCs w:val="24"/>
                 <w14:ligatures w14:val="none"/>
               </w:rPr>
+              <w:t>7</w:t>
+            </w:r>
+          </w:p>
+        </w:tc>
+        <w:tc>
+          <w:tcPr>
+            <w:tcW w:w="0" w:type="auto"/>
+            <w:vAlign w:val="center"/>
+            <w:hideMark/>
+          </w:tcPr>
+          <w:p>
+            <w:pPr>
+              <w:spacing w:before="100" w:beforeAutospacing="1" w:after="100" w:afterAutospacing="1"/>
+              <w:rPr>
+                <w:rFonts w:eastAsia="Times New Roman"/>
+                <w:color w:val="auto"/>
+                <w:kern w:val="0"/>
+                <w:szCs w:val="24"/>
+                <w14:ligatures w14:val="none"/>
+              </w:rPr>
+            </w:pPr>
+            <w:r>
+              <w:rPr>
+                <w:rFonts w:eastAsia="Times New Roman"/>
+                <w:color w:val="auto"/>
+                <w:kern w:val="0"/>
+                <w:szCs w:val="24"/>
+                <w14:ligatures w14:val="none"/>
+              </w:rPr>
+              <w:t>Program of more than 2 years (College, CEGEP and other non-university)</w:t>
+            </w:r>
+          </w:p>
+        </w:tc>
+        <w:tc>
+          <w:tcPr>
+            <w:tcW w:w="0" w:type="auto"/>
+            <w:vAlign w:val="center"/>
+            <w:hideMark/>
+          </w:tcPr>
+          <w:p>
+            <w:pPr>
+              <w:spacing w:before="100" w:beforeAutospacing="1" w:after="100" w:afterAutospacing="1"/>
+              <w:rPr>
+                <w:rFonts w:eastAsia="Times New Roman"/>
+                <w:color w:val="auto"/>
+                <w:kern w:val="0"/>
+                <w:szCs w:val="24"/>
+                <w14:ligatures w14:val="none"/>
+              </w:rPr>
+            </w:pPr>
+            <w:r>
+              <w:rPr>
+                <w:rFonts w:eastAsia="Times New Roman"/>
+                <w:color w:val="auto"/>
+                <w:kern w:val="0"/>
+                <w:szCs w:val="24"/>
+                <w14:ligatures w14:val="none"/>
+              </w:rPr>
+              <w:t>53,855</w:t>
+            </w:r>
+          </w:p>
+        </w:tc>
+        <w:tc>
+          <w:tcPr>
+            <w:tcW w:w="0" w:type="auto"/>
+            <w:vAlign w:val="center"/>
+            <w:hideMark/>
+          </w:tcPr>
+          <w:p>
+            <w:pPr>
+              <w:spacing w:before="100" w:beforeAutospacing="1" w:after="100" w:afterAutospacing="1"/>
+              <w:rPr>
+                <w:rFonts w:eastAsia="Times New Roman"/>
+                <w:color w:val="auto"/>
+                <w:kern w:val="0"/>
+                <w:szCs w:val="24"/>
+                <w14:ligatures w14:val="none"/>
+              </w:rPr>
+            </w:pPr>
+            <w:r>
+              <w:rPr>
+                <w:rFonts w:eastAsia="Times New Roman"/>
+                <w:color w:val="auto"/>
+                <w:kern w:val="0"/>
+                <w:szCs w:val="24"/>
+                <w14:ligatures w14:val="none"/>
+              </w:rPr>
+              <w:t>1,994,674.2</w:t>
+            </w:r>
+          </w:p>
+        </w:tc>
+        <w:tc>
+          <w:tcPr>
+            <w:tcW w:w="0" w:type="auto"/>
+            <w:vAlign w:val="center"/>
+            <w:hideMark/>
+          </w:tcPr>
+          <w:p>
+            <w:pPr>
+              <w:spacing w:before="100" w:beforeAutospacing="1" w:after="100" w:afterAutospacing="1"/>
+              <w:rPr>
+                <w:rFonts w:eastAsia="Times New Roman"/>
+                <w:color w:val="auto"/>
+                <w:kern w:val="0"/>
+                <w:szCs w:val="24"/>
+                <w14:ligatures w14:val="none"/>
+              </w:rPr>
+            </w:pPr>
+            <w:r>
+              <w:rPr>
+                <w:rFonts w:eastAsia="Times New Roman"/>
+                <w:color w:val="auto"/>
+                <w:kern w:val="0"/>
+                <w:szCs w:val="24"/>
+                <w14:ligatures w14:val="none"/>
+              </w:rPr>
+              <w:t>7.0%</w:t>
+            </w:r>
+          </w:p>
+        </w:tc>
+      </w:tr>
+      <w:tr>
+        <w:trPr>
+          <w:tblCellSpacing w:w="15" w:type="dxa"/>
+        </w:trPr>
+        <w:tc>
+          <w:tcPr>
+            <w:tcW w:w="0" w:type="auto"/>
+            <w:vAlign w:val="center"/>
+            <w:hideMark/>
+          </w:tcPr>
+          <w:p>
+            <w:pPr>
+              <w:spacing w:before="100" w:beforeAutospacing="1" w:after="100" w:afterAutospacing="1"/>
+              <w:rPr>
+                <w:rFonts w:eastAsia="Times New Roman"/>
+                <w:color w:val="auto"/>
+                <w:kern w:val="0"/>
+                <w:szCs w:val="24"/>
+                <w14:ligatures w14:val="none"/>
+              </w:rPr>
+            </w:pPr>
+            <w:r>
+              <w:rPr>
+                <w:rFonts w:eastAsia="Times New Roman"/>
+                <w:color w:val="auto"/>
+                <w:kern w:val="0"/>
+                <w:szCs w:val="24"/>
+                <w14:ligatures w14:val="none"/>
+              </w:rPr>
+              <w:t>8</w:t>
+            </w:r>
+          </w:p>
+        </w:tc>
+        <w:tc>
+          <w:tcPr>
+            <w:tcW w:w="0" w:type="auto"/>
+            <w:vAlign w:val="center"/>
+            <w:hideMark/>
+          </w:tcPr>
+          <w:p>
+            <w:pPr>
+              <w:spacing w:before="100" w:beforeAutospacing="1" w:after="100" w:afterAutospacing="1"/>
+              <w:rPr>
+                <w:rFonts w:eastAsia="Times New Roman"/>
+                <w:color w:val="auto"/>
+                <w:kern w:val="0"/>
+                <w:szCs w:val="24"/>
+                <w14:ligatures w14:val="none"/>
+              </w:rPr>
+            </w:pPr>
+            <w:r>
+              <w:rPr>
+                <w:rFonts w:eastAsia="Times New Roman"/>
+                <w:color w:val="auto"/>
+                <w:kern w:val="0"/>
+                <w:szCs w:val="24"/>
+                <w14:ligatures w14:val="none"/>
+              </w:rPr>
+              <w:t>University certificate or diploma below bachelor level</w:t>
+            </w:r>
+          </w:p>
+        </w:tc>
+        <w:tc>
+          <w:tcPr>
+            <w:tcW w:w="0" w:type="auto"/>
+            <w:vAlign w:val="center"/>
+            <w:hideMark/>
+          </w:tcPr>
+          <w:p>
+            <w:pPr>
+              <w:spacing w:before="100" w:beforeAutospacing="1" w:after="100" w:afterAutospacing="1"/>
+              <w:rPr>
+                <w:rFonts w:eastAsia="Times New Roman"/>
+                <w:color w:val="auto"/>
+                <w:kern w:val="0"/>
+                <w:szCs w:val="24"/>
+                <w14:ligatures w14:val="none"/>
+              </w:rPr>
+            </w:pPr>
+            <w:r>
+              <w:rPr>
+                <w:rFonts w:eastAsia="Times New Roman"/>
+                <w:color w:val="auto"/>
+                <w:kern w:val="0"/>
+                <w:szCs w:val="24"/>
+                <w14:ligatures w14:val="none"/>
+              </w:rPr>
+              <w:t>20,853</w:t>
+            </w:r>
+          </w:p>
+        </w:tc>
+        <w:tc>
+          <w:tcPr>
+            <w:tcW w:w="0" w:type="auto"/>
+            <w:vAlign w:val="center"/>
+            <w:hideMark/>
+          </w:tcPr>
+          <w:p>
+            <w:pPr>
+              <w:spacing w:before="100" w:beforeAutospacing="1" w:after="100" w:afterAutospacing="1"/>
+              <w:rPr>
+                <w:rFonts w:eastAsia="Times New Roman"/>
+                <w:color w:val="auto"/>
+                <w:kern w:val="0"/>
+                <w:szCs w:val="24"/>
+                <w14:ligatures w14:val="none"/>
+              </w:rPr>
+            </w:pPr>
+            <w:r>
+              <w:rPr>
+                <w:rFonts w:eastAsia="Times New Roman"/>
+                <w:color w:val="auto"/>
+                <w:kern w:val="0"/>
+                <w:szCs w:val="24"/>
+                <w14:ligatures w14:val="none"/>
+              </w:rPr>
+              <w:t>772,341.9</w:t>
+            </w:r>
+          </w:p>
+        </w:tc>
+        <w:tc>
+          <w:tcPr>
+            <w:tcW w:w="0" w:type="auto"/>
+            <w:vAlign w:val="center"/>
+            <w:hideMark/>
+          </w:tcPr>
+          <w:p>
+            <w:pPr>
+              <w:spacing w:before="100" w:beforeAutospacing="1" w:after="100" w:afterAutospacing="1"/>
+              <w:rPr>
+                <w:rFonts w:eastAsia="Times New Roman"/>
+                <w:color w:val="auto"/>
+                <w:kern w:val="0"/>
+                <w:szCs w:val="24"/>
+                <w14:ligatures w14:val="none"/>
+              </w:rPr>
+            </w:pPr>
+            <w:r>
+              <w:rPr>
+                <w:rFonts w:eastAsia="Times New Roman"/>
+                <w:color w:val="auto"/>
+                <w:kern w:val="0"/>
+                <w:szCs w:val="24"/>
+                <w14:ligatures w14:val="none"/>
+              </w:rPr>
+              <w:t>2.7%</w:t>
+            </w:r>
+          </w:p>
+        </w:tc>
+      </w:tr>
+      <w:tr>
+        <w:trPr>
+          <w:tblCellSpacing w:w="15" w:type="dxa"/>
+        </w:trPr>
+        <w:tc>
+          <w:tcPr>
+            <w:tcW w:w="0" w:type="auto"/>
+            <w:vAlign w:val="center"/>
+            <w:hideMark/>
+          </w:tcPr>
+          <w:p>
+            <w:pPr>
+              <w:spacing w:before="100" w:beforeAutospacing="1" w:after="100" w:afterAutospacing="1"/>
+              <w:rPr>
+                <w:rFonts w:eastAsia="Times New Roman"/>
+                <w:color w:val="auto"/>
+                <w:kern w:val="0"/>
+                <w:szCs w:val="24"/>
+                <w14:ligatures w14:val="none"/>
+              </w:rPr>
+            </w:pPr>
+            <w:r>
+              <w:rPr>
+                <w:rFonts w:eastAsia="Times New Roman"/>
+                <w:color w:val="auto"/>
+                <w:kern w:val="0"/>
+                <w:szCs w:val="24"/>
+                <w14:ligatures w14:val="none"/>
+              </w:rPr>
               <w:t>9</w:t>
             </w:r>
           </w:p>
@@ -5047,6 +5805,906 @@
                 <w:szCs w:val="24"/>
                 <w14:ligatures w14:val="none"/>
               </w:rPr>
+              <w:t>Bachelor’s degree</w:t>
+            </w:r>
+          </w:p>
+        </w:tc>
+        <w:tc>
+          <w:tcPr>
+            <w:tcW w:w="0" w:type="auto"/>
+            <w:vAlign w:val="center"/>
+            <w:hideMark/>
+          </w:tcPr>
+          <w:p>
+            <w:pPr>
+              <w:spacing w:before="100" w:beforeAutospacing="1" w:after="100" w:afterAutospacing="1"/>
+              <w:rPr>
+                <w:rFonts w:eastAsia="Times New Roman"/>
+                <w:color w:val="auto"/>
+                <w:kern w:val="0"/>
+                <w:szCs w:val="24"/>
+                <w14:ligatures w14:val="none"/>
+              </w:rPr>
+            </w:pPr>
+            <w:r>
+              <w:rPr>
+                <w:rFonts w:eastAsia="Times New Roman"/>
+                <w:color w:val="auto"/>
+                <w:kern w:val="0"/>
+                <w:szCs w:val="24"/>
+                <w14:ligatures w14:val="none"/>
+              </w:rPr>
+              <w:t>119,686</w:t>
+            </w:r>
+          </w:p>
+        </w:tc>
+        <w:tc>
+          <w:tcPr>
+            <w:tcW w:w="0" w:type="auto"/>
+            <w:vAlign w:val="center"/>
+            <w:hideMark/>
+          </w:tcPr>
+          <w:p>
+            <w:pPr>
+              <w:spacing w:before="100" w:beforeAutospacing="1" w:after="100" w:afterAutospacing="1"/>
+              <w:rPr>
+                <w:rFonts w:eastAsia="Times New Roman"/>
+                <w:color w:val="auto"/>
+                <w:kern w:val="0"/>
+                <w:szCs w:val="24"/>
+                <w14:ligatures w14:val="none"/>
+              </w:rPr>
+            </w:pPr>
+            <w:r>
+              <w:rPr>
+                <w:rFonts w:eastAsia="Times New Roman"/>
+                <w:color w:val="auto"/>
+                <w:kern w:val="0"/>
+                <w:szCs w:val="24"/>
+                <w14:ligatures w14:val="none"/>
+              </w:rPr>
+              <w:t>4,432,780.6</w:t>
+            </w:r>
+          </w:p>
+        </w:tc>
+        <w:tc>
+          <w:tcPr>
+            <w:tcW w:w="0" w:type="auto"/>
+            <w:vAlign w:val="center"/>
+            <w:hideMark/>
+          </w:tcPr>
+          <w:p>
+            <w:pPr>
+              <w:spacing w:before="100" w:beforeAutospacing="1" w:after="100" w:afterAutospacing="1"/>
+              <w:rPr>
+                <w:rFonts w:eastAsia="Times New Roman"/>
+                <w:color w:val="auto"/>
+                <w:kern w:val="0"/>
+                <w:szCs w:val="24"/>
+                <w14:ligatures w14:val="none"/>
+              </w:rPr>
+            </w:pPr>
+            <w:r>
+              <w:rPr>
+                <w:rFonts w:eastAsia="Times New Roman"/>
+                <w:color w:val="auto"/>
+                <w:kern w:val="0"/>
+                <w:szCs w:val="24"/>
+                <w14:ligatures w14:val="none"/>
+              </w:rPr>
+              <w:t>15.5%</w:t>
+            </w:r>
+          </w:p>
+        </w:tc>
+      </w:tr>
+      <w:tr>
+        <w:trPr>
+          <w:tblCellSpacing w:w="15" w:type="dxa"/>
+        </w:trPr>
+        <w:tc>
+          <w:tcPr>
+            <w:tcW w:w="0" w:type="auto"/>
+            <w:vAlign w:val="center"/>
+            <w:hideMark/>
+          </w:tcPr>
+          <w:p>
+            <w:pPr>
+              <w:spacing w:before="100" w:beforeAutospacing="1" w:after="100" w:afterAutospacing="1"/>
+              <w:rPr>
+                <w:rFonts w:eastAsia="Times New Roman"/>
+                <w:color w:val="auto"/>
+                <w:kern w:val="0"/>
+                <w:szCs w:val="24"/>
+                <w14:ligatures w14:val="none"/>
+              </w:rPr>
+            </w:pPr>
+            <w:r>
+              <w:rPr>
+                <w:rFonts w:eastAsia="Times New Roman"/>
+                <w:color w:val="auto"/>
+                <w:kern w:val="0"/>
+                <w:szCs w:val="24"/>
+                <w14:ligatures w14:val="none"/>
+              </w:rPr>
+              <w:t>10</w:t>
+            </w:r>
+          </w:p>
+        </w:tc>
+        <w:tc>
+          <w:tcPr>
+            <w:tcW w:w="0" w:type="auto"/>
+            <w:vAlign w:val="center"/>
+            <w:hideMark/>
+          </w:tcPr>
+          <w:p>
+            <w:pPr>
+              <w:spacing w:before="100" w:beforeAutospacing="1" w:after="100" w:afterAutospacing="1"/>
+              <w:rPr>
+                <w:rFonts w:eastAsia="Times New Roman"/>
+                <w:color w:val="auto"/>
+                <w:kern w:val="0"/>
+                <w:szCs w:val="24"/>
+                <w14:ligatures w14:val="none"/>
+              </w:rPr>
+            </w:pPr>
+            <w:r>
+              <w:rPr>
+                <w:rFonts w:eastAsia="Times New Roman"/>
+                <w:color w:val="auto"/>
+                <w:kern w:val="0"/>
+                <w:szCs w:val="24"/>
+                <w14:ligatures w14:val="none"/>
+              </w:rPr>
+              <w:t>University certificate or diploma above bachelor level</w:t>
+            </w:r>
+          </w:p>
+        </w:tc>
+        <w:tc>
+          <w:tcPr>
+            <w:tcW w:w="0" w:type="auto"/>
+            <w:vAlign w:val="center"/>
+            <w:hideMark/>
+          </w:tcPr>
+          <w:p>
+            <w:pPr>
+              <w:spacing w:before="100" w:beforeAutospacing="1" w:after="100" w:afterAutospacing="1"/>
+              <w:rPr>
+                <w:rFonts w:eastAsia="Times New Roman"/>
+                <w:color w:val="auto"/>
+                <w:kern w:val="0"/>
+                <w:szCs w:val="24"/>
+                <w14:ligatures w14:val="none"/>
+              </w:rPr>
+            </w:pPr>
+            <w:r>
+              <w:rPr>
+                <w:rFonts w:eastAsia="Times New Roman"/>
+                <w:color w:val="auto"/>
+                <w:kern w:val="0"/>
+                <w:szCs w:val="24"/>
+                <w14:ligatures w14:val="none"/>
+              </w:rPr>
+              <w:t>11,295</w:t>
+            </w:r>
+          </w:p>
+        </w:tc>
+        <w:tc>
+          <w:tcPr>
+            <w:tcW w:w="0" w:type="auto"/>
+            <w:vAlign w:val="center"/>
+            <w:hideMark/>
+          </w:tcPr>
+          <w:p>
+            <w:pPr>
+              <w:spacing w:before="100" w:beforeAutospacing="1" w:after="100" w:afterAutospacing="1"/>
+              <w:rPr>
+                <w:rFonts w:eastAsia="Times New Roman"/>
+                <w:color w:val="auto"/>
+                <w:kern w:val="0"/>
+                <w:szCs w:val="24"/>
+                <w14:ligatures w14:val="none"/>
+              </w:rPr>
+            </w:pPr>
+            <w:r>
+              <w:rPr>
+                <w:rFonts w:eastAsia="Times New Roman"/>
+                <w:color w:val="auto"/>
+                <w:kern w:val="0"/>
+                <w:szCs w:val="24"/>
+                <w14:ligatures w14:val="none"/>
+              </w:rPr>
+              <w:t>418,337.8</w:t>
+            </w:r>
+          </w:p>
+        </w:tc>
+        <w:tc>
+          <w:tcPr>
+            <w:tcW w:w="0" w:type="auto"/>
+            <w:vAlign w:val="center"/>
+            <w:hideMark/>
+          </w:tcPr>
+          <w:p>
+            <w:pPr>
+              <w:spacing w:before="100" w:beforeAutospacing="1" w:after="100" w:afterAutospacing="1"/>
+              <w:rPr>
+                <w:rFonts w:eastAsia="Times New Roman"/>
+                <w:color w:val="auto"/>
+                <w:kern w:val="0"/>
+                <w:szCs w:val="24"/>
+                <w14:ligatures w14:val="none"/>
+              </w:rPr>
+            </w:pPr>
+            <w:r>
+              <w:rPr>
+                <w:rFonts w:eastAsia="Times New Roman"/>
+                <w:color w:val="auto"/>
+                <w:kern w:val="0"/>
+                <w:szCs w:val="24"/>
+                <w14:ligatures w14:val="none"/>
+              </w:rPr>
+              <w:t>1.5%</w:t>
+            </w:r>
+          </w:p>
+        </w:tc>
+      </w:tr>
+      <w:tr>
+        <w:trPr>
+          <w:tblCellSpacing w:w="15" w:type="dxa"/>
+        </w:trPr>
+        <w:tc>
+          <w:tcPr>
+            <w:tcW w:w="0" w:type="auto"/>
+            <w:vAlign w:val="center"/>
+            <w:hideMark/>
+          </w:tcPr>
+          <w:p>
+            <w:pPr>
+              <w:spacing w:before="100" w:beforeAutospacing="1" w:after="100" w:afterAutospacing="1"/>
+              <w:rPr>
+                <w:rFonts w:eastAsia="Times New Roman"/>
+                <w:color w:val="auto"/>
+                <w:kern w:val="0"/>
+                <w:szCs w:val="24"/>
+                <w14:ligatures w14:val="none"/>
+              </w:rPr>
+            </w:pPr>
+            <w:r>
+              <w:rPr>
+                <w:rFonts w:eastAsia="Times New Roman"/>
+                <w:color w:val="auto"/>
+                <w:kern w:val="0"/>
+                <w:szCs w:val="24"/>
+                <w14:ligatures w14:val="none"/>
+              </w:rPr>
+              <w:t>11</w:t>
+            </w:r>
+          </w:p>
+        </w:tc>
+        <w:tc>
+          <w:tcPr>
+            <w:tcW w:w="0" w:type="auto"/>
+            <w:vAlign w:val="center"/>
+            <w:hideMark/>
+          </w:tcPr>
+          <w:p>
+            <w:pPr>
+              <w:spacing w:before="100" w:beforeAutospacing="1" w:after="100" w:afterAutospacing="1"/>
+              <w:rPr>
+                <w:rFonts w:eastAsia="Times New Roman"/>
+                <w:color w:val="auto"/>
+                <w:kern w:val="0"/>
+                <w:szCs w:val="24"/>
+                <w14:ligatures w14:val="none"/>
+              </w:rPr>
+            </w:pPr>
+            <w:r>
+              <w:rPr>
+                <w:rFonts w:eastAsia="Times New Roman"/>
+                <w:color w:val="auto"/>
+                <w:kern w:val="0"/>
+                <w:szCs w:val="24"/>
+                <w14:ligatures w14:val="none"/>
+              </w:rPr>
+              <w:t>Degree in medicine, dentistry, veterinary medicine or optometry</w:t>
+            </w:r>
+          </w:p>
+        </w:tc>
+        <w:tc>
+          <w:tcPr>
+            <w:tcW w:w="0" w:type="auto"/>
+            <w:vAlign w:val="center"/>
+            <w:hideMark/>
+          </w:tcPr>
+          <w:p>
+            <w:pPr>
+              <w:spacing w:before="100" w:beforeAutospacing="1" w:after="100" w:afterAutospacing="1"/>
+              <w:rPr>
+                <w:rFonts w:eastAsia="Times New Roman"/>
+                <w:color w:val="auto"/>
+                <w:kern w:val="0"/>
+                <w:szCs w:val="24"/>
+                <w14:ligatures w14:val="none"/>
+              </w:rPr>
+            </w:pPr>
+            <w:r>
+              <w:rPr>
+                <w:rFonts w:eastAsia="Times New Roman"/>
+                <w:color w:val="auto"/>
+                <w:kern w:val="0"/>
+                <w:szCs w:val="24"/>
+                <w14:ligatures w14:val="none"/>
+              </w:rPr>
+              <w:t>4,433</w:t>
+            </w:r>
+          </w:p>
+        </w:tc>
+        <w:tc>
+          <w:tcPr>
+            <w:tcW w:w="0" w:type="auto"/>
+            <w:vAlign w:val="center"/>
+            <w:hideMark/>
+          </w:tcPr>
+          <w:p>
+            <w:pPr>
+              <w:spacing w:before="100" w:beforeAutospacing="1" w:after="100" w:afterAutospacing="1"/>
+              <w:rPr>
+                <w:rFonts w:eastAsia="Times New Roman"/>
+                <w:color w:val="auto"/>
+                <w:kern w:val="0"/>
+                <w:szCs w:val="24"/>
+                <w14:ligatures w14:val="none"/>
+              </w:rPr>
+            </w:pPr>
+            <w:r>
+              <w:rPr>
+                <w:rFonts w:eastAsia="Times New Roman"/>
+                <w:color w:val="auto"/>
+                <w:kern w:val="0"/>
+                <w:szCs w:val="24"/>
+                <w14:ligatures w14:val="none"/>
+              </w:rPr>
+              <w:t>164,184.5</w:t>
+            </w:r>
+          </w:p>
+        </w:tc>
+        <w:tc>
+          <w:tcPr>
+            <w:tcW w:w="0" w:type="auto"/>
+            <w:vAlign w:val="center"/>
+            <w:hideMark/>
+          </w:tcPr>
+          <w:p>
+            <w:pPr>
+              <w:spacing w:before="100" w:beforeAutospacing="1" w:after="100" w:afterAutospacing="1"/>
+              <w:rPr>
+                <w:rFonts w:eastAsia="Times New Roman"/>
+                <w:color w:val="auto"/>
+                <w:kern w:val="0"/>
+                <w:szCs w:val="24"/>
+                <w14:ligatures w14:val="none"/>
+              </w:rPr>
+            </w:pPr>
+            <w:r>
+              <w:rPr>
+                <w:rFonts w:eastAsia="Times New Roman"/>
+                <w:color w:val="auto"/>
+                <w:kern w:val="0"/>
+                <w:szCs w:val="24"/>
+                <w14:ligatures w14:val="none"/>
+              </w:rPr>
+              <w:t>0.6%</w:t>
+            </w:r>
+          </w:p>
+        </w:tc>
+      </w:tr>
+      <w:tr>
+        <w:trPr>
+          <w:tblCellSpacing w:w="15" w:type="dxa"/>
+        </w:trPr>
+        <w:tc>
+          <w:tcPr>
+            <w:tcW w:w="0" w:type="auto"/>
+            <w:vAlign w:val="center"/>
+            <w:hideMark/>
+          </w:tcPr>
+          <w:p>
+            <w:pPr>
+              <w:spacing w:before="100" w:beforeAutospacing="1" w:after="100" w:afterAutospacing="1"/>
+              <w:rPr>
+                <w:rFonts w:eastAsia="Times New Roman"/>
+                <w:color w:val="auto"/>
+                <w:kern w:val="0"/>
+                <w:szCs w:val="24"/>
+                <w14:ligatures w14:val="none"/>
+              </w:rPr>
+            </w:pPr>
+            <w:r>
+              <w:rPr>
+                <w:rFonts w:eastAsia="Times New Roman"/>
+                <w:color w:val="auto"/>
+                <w:kern w:val="0"/>
+                <w:szCs w:val="24"/>
+                <w14:ligatures w14:val="none"/>
+              </w:rPr>
+              <w:t>12</w:t>
+            </w:r>
+          </w:p>
+        </w:tc>
+        <w:tc>
+          <w:tcPr>
+            <w:tcW w:w="0" w:type="auto"/>
+            <w:vAlign w:val="center"/>
+            <w:hideMark/>
+          </w:tcPr>
+          <w:p>
+            <w:pPr>
+              <w:spacing w:before="100" w:beforeAutospacing="1" w:after="100" w:afterAutospacing="1"/>
+              <w:rPr>
+                <w:rFonts w:eastAsia="Times New Roman"/>
+                <w:color w:val="auto"/>
+                <w:kern w:val="0"/>
+                <w:szCs w:val="24"/>
+                <w14:ligatures w14:val="none"/>
+              </w:rPr>
+            </w:pPr>
+            <w:r>
+              <w:rPr>
+                <w:rFonts w:eastAsia="Times New Roman"/>
+                <w:color w:val="auto"/>
+                <w:kern w:val="0"/>
+                <w:szCs w:val="24"/>
+                <w14:ligatures w14:val="none"/>
+              </w:rPr>
+              <w:t>Master’s degree</w:t>
+            </w:r>
+          </w:p>
+        </w:tc>
+        <w:tc>
+          <w:tcPr>
+            <w:tcW w:w="0" w:type="auto"/>
+            <w:vAlign w:val="center"/>
+            <w:hideMark/>
+          </w:tcPr>
+          <w:p>
+            <w:pPr>
+              <w:spacing w:before="100" w:beforeAutospacing="1" w:after="100" w:afterAutospacing="1"/>
+              <w:rPr>
+                <w:rFonts w:eastAsia="Times New Roman"/>
+                <w:color w:val="auto"/>
+                <w:kern w:val="0"/>
+                <w:szCs w:val="24"/>
+                <w14:ligatures w14:val="none"/>
+              </w:rPr>
+            </w:pPr>
+            <w:r>
+              <w:rPr>
+                <w:rFonts w:eastAsia="Times New Roman"/>
+                <w:color w:val="auto"/>
+                <w:kern w:val="0"/>
+                <w:szCs w:val="24"/>
+                <w14:ligatures w14:val="none"/>
+              </w:rPr>
+              <w:t>35,374</w:t>
+            </w:r>
+          </w:p>
+        </w:tc>
+        <w:tc>
+          <w:tcPr>
+            <w:tcW w:w="0" w:type="auto"/>
+            <w:vAlign w:val="center"/>
+            <w:hideMark/>
+          </w:tcPr>
+          <w:p>
+            <w:pPr>
+              <w:spacing w:before="100" w:beforeAutospacing="1" w:after="100" w:afterAutospacing="1"/>
+              <w:rPr>
+                <w:rFonts w:eastAsia="Times New Roman"/>
+                <w:color w:val="auto"/>
+                <w:kern w:val="0"/>
+                <w:szCs w:val="24"/>
+                <w14:ligatures w14:val="none"/>
+              </w:rPr>
+            </w:pPr>
+            <w:r>
+              <w:rPr>
+                <w:rFonts w:eastAsia="Times New Roman"/>
+                <w:color w:val="auto"/>
+                <w:kern w:val="0"/>
+                <w:szCs w:val="24"/>
+                <w14:ligatures w14:val="none"/>
+              </w:rPr>
+              <w:t>1,310,156.6</w:t>
+            </w:r>
+          </w:p>
+        </w:tc>
+        <w:tc>
+          <w:tcPr>
+            <w:tcW w:w="0" w:type="auto"/>
+            <w:vAlign w:val="center"/>
+            <w:hideMark/>
+          </w:tcPr>
+          <w:p>
+            <w:pPr>
+              <w:spacing w:before="100" w:beforeAutospacing="1" w:after="100" w:afterAutospacing="1"/>
+              <w:rPr>
+                <w:rFonts w:eastAsia="Times New Roman"/>
+                <w:color w:val="auto"/>
+                <w:kern w:val="0"/>
+                <w:szCs w:val="24"/>
+                <w14:ligatures w14:val="none"/>
+              </w:rPr>
+            </w:pPr>
+            <w:r>
+              <w:rPr>
+                <w:rFonts w:eastAsia="Times New Roman"/>
+                <w:color w:val="auto"/>
+                <w:kern w:val="0"/>
+                <w:szCs w:val="24"/>
+                <w14:ligatures w14:val="none"/>
+              </w:rPr>
+              <w:t>4.6%</w:t>
+            </w:r>
+          </w:p>
+        </w:tc>
+      </w:tr>
+      <w:tr>
+        <w:trPr>
+          <w:tblCellSpacing w:w="15" w:type="dxa"/>
+        </w:trPr>
+        <w:tc>
+          <w:tcPr>
+            <w:tcW w:w="0" w:type="auto"/>
+            <w:vAlign w:val="center"/>
+            <w:hideMark/>
+          </w:tcPr>
+          <w:p>
+            <w:pPr>
+              <w:spacing w:before="100" w:beforeAutospacing="1" w:after="100" w:afterAutospacing="1"/>
+              <w:rPr>
+                <w:rFonts w:eastAsia="Times New Roman"/>
+                <w:color w:val="auto"/>
+                <w:kern w:val="0"/>
+                <w:szCs w:val="24"/>
+                <w14:ligatures w14:val="none"/>
+              </w:rPr>
+            </w:pPr>
+            <w:r>
+              <w:rPr>
+                <w:rFonts w:eastAsia="Times New Roman"/>
+                <w:color w:val="auto"/>
+                <w:kern w:val="0"/>
+                <w:szCs w:val="24"/>
+                <w14:ligatures w14:val="none"/>
+              </w:rPr>
+              <w:t>13</w:t>
+            </w:r>
+          </w:p>
+        </w:tc>
+        <w:tc>
+          <w:tcPr>
+            <w:tcW w:w="0" w:type="auto"/>
+            <w:vAlign w:val="center"/>
+            <w:hideMark/>
+          </w:tcPr>
+          <w:p>
+            <w:pPr>
+              <w:spacing w:before="100" w:beforeAutospacing="1" w:after="100" w:afterAutospacing="1"/>
+              <w:rPr>
+                <w:rFonts w:eastAsia="Times New Roman"/>
+                <w:color w:val="auto"/>
+                <w:kern w:val="0"/>
+                <w:szCs w:val="24"/>
+                <w14:ligatures w14:val="none"/>
+              </w:rPr>
+            </w:pPr>
+            <w:r>
+              <w:rPr>
+                <w:rFonts w:eastAsia="Times New Roman"/>
+                <w:color w:val="auto"/>
+                <w:kern w:val="0"/>
+                <w:szCs w:val="24"/>
+                <w14:ligatures w14:val="none"/>
+              </w:rPr>
+              <w:t>Earned doctorate</w:t>
+            </w:r>
+          </w:p>
+        </w:tc>
+        <w:tc>
+          <w:tcPr>
+            <w:tcW w:w="0" w:type="auto"/>
+            <w:vAlign w:val="center"/>
+            <w:hideMark/>
+          </w:tcPr>
+          <w:p>
+            <w:pPr>
+              <w:spacing w:before="100" w:beforeAutospacing="1" w:after="100" w:afterAutospacing="1"/>
+              <w:rPr>
+                <w:rFonts w:eastAsia="Times New Roman"/>
+                <w:color w:val="auto"/>
+                <w:kern w:val="0"/>
+                <w:szCs w:val="24"/>
+                <w14:ligatures w14:val="none"/>
+              </w:rPr>
+            </w:pPr>
+            <w:r>
+              <w:rPr>
+                <w:rFonts w:eastAsia="Times New Roman"/>
+                <w:color w:val="auto"/>
+                <w:kern w:val="0"/>
+                <w:szCs w:val="24"/>
+                <w14:ligatures w14:val="none"/>
+              </w:rPr>
+              <w:t>5,478</w:t>
+            </w:r>
+          </w:p>
+        </w:tc>
+        <w:tc>
+          <w:tcPr>
+            <w:tcW w:w="0" w:type="auto"/>
+            <w:vAlign w:val="center"/>
+            <w:hideMark/>
+          </w:tcPr>
+          <w:p>
+            <w:pPr>
+              <w:spacing w:before="100" w:beforeAutospacing="1" w:after="100" w:afterAutospacing="1"/>
+              <w:rPr>
+                <w:rFonts w:eastAsia="Times New Roman"/>
+                <w:color w:val="auto"/>
+                <w:kern w:val="0"/>
+                <w:szCs w:val="24"/>
+                <w14:ligatures w14:val="none"/>
+              </w:rPr>
+            </w:pPr>
+            <w:r>
+              <w:rPr>
+                <w:rFonts w:eastAsia="Times New Roman"/>
+                <w:color w:val="auto"/>
+                <w:kern w:val="0"/>
+                <w:szCs w:val="24"/>
+                <w14:ligatures w14:val="none"/>
+              </w:rPr>
+              <w:t>202,889.3</w:t>
+            </w:r>
+          </w:p>
+        </w:tc>
+        <w:tc>
+          <w:tcPr>
+            <w:tcW w:w="0" w:type="auto"/>
+            <w:vAlign w:val="center"/>
+            <w:hideMark/>
+          </w:tcPr>
+          <w:p>
+            <w:pPr>
+              <w:spacing w:before="100" w:beforeAutospacing="1" w:after="100" w:afterAutospacing="1"/>
+              <w:rPr>
+                <w:rFonts w:eastAsia="Times New Roman"/>
+                <w:color w:val="auto"/>
+                <w:kern w:val="0"/>
+                <w:szCs w:val="24"/>
+                <w14:ligatures w14:val="none"/>
+              </w:rPr>
+            </w:pPr>
+            <w:r>
+              <w:rPr>
+                <w:rFonts w:eastAsia="Times New Roman"/>
+                <w:color w:val="auto"/>
+                <w:kern w:val="0"/>
+                <w:szCs w:val="24"/>
+                <w14:ligatures w14:val="none"/>
+              </w:rPr>
+              <w:t>0.7%</w:t>
+            </w:r>
+          </w:p>
+        </w:tc>
+      </w:tr>
+      <w:tr>
+        <w:trPr>
+          <w:tblCellSpacing w:w="15" w:type="dxa"/>
+        </w:trPr>
+        <w:tc>
+          <w:tcPr>
+            <w:tcW w:w="0" w:type="auto"/>
+            <w:vAlign w:val="center"/>
+            <w:hideMark/>
+          </w:tcPr>
+          <w:p>
+            <w:pPr>
+              <w:spacing w:before="100" w:beforeAutospacing="1" w:after="100" w:afterAutospacing="1"/>
+              <w:rPr>
+                <w:rFonts w:eastAsia="Times New Roman"/>
+                <w:color w:val="auto"/>
+                <w:kern w:val="0"/>
+                <w:szCs w:val="24"/>
+                <w14:ligatures w14:val="none"/>
+              </w:rPr>
+            </w:pPr>
+            <w:r>
+              <w:rPr>
+                <w:rFonts w:eastAsia="Times New Roman"/>
+                <w:color w:val="auto"/>
+                <w:kern w:val="0"/>
+                <w:szCs w:val="24"/>
+                <w14:ligatures w14:val="none"/>
+              </w:rPr>
+              <w:t>88</w:t>
+            </w:r>
+          </w:p>
+        </w:tc>
+        <w:tc>
+          <w:tcPr>
+            <w:tcW w:w="0" w:type="auto"/>
+            <w:vAlign w:val="center"/>
+            <w:hideMark/>
+          </w:tcPr>
+          <w:p>
+            <w:pPr>
+              <w:spacing w:before="100" w:beforeAutospacing="1" w:after="100" w:afterAutospacing="1"/>
+              <w:rPr>
+                <w:rFonts w:eastAsia="Times New Roman"/>
+                <w:color w:val="auto"/>
+                <w:kern w:val="0"/>
+                <w:szCs w:val="24"/>
+                <w14:ligatures w14:val="none"/>
+              </w:rPr>
+            </w:pPr>
+            <w:r>
+              <w:rPr>
+                <w:rFonts w:eastAsia="Times New Roman"/>
+                <w:color w:val="auto"/>
+                <w:kern w:val="0"/>
+                <w:szCs w:val="24"/>
+                <w14:ligatures w14:val="none"/>
+              </w:rPr>
+              <w:t>Not available</w:t>
+            </w:r>
+          </w:p>
+        </w:tc>
+        <w:tc>
+          <w:tcPr>
+            <w:tcW w:w="0" w:type="auto"/>
+            <w:vAlign w:val="center"/>
+            <w:hideMark/>
+          </w:tcPr>
+          <w:p>
+            <w:pPr>
+              <w:spacing w:before="100" w:beforeAutospacing="1" w:after="100" w:afterAutospacing="1"/>
+              <w:rPr>
+                <w:rFonts w:eastAsia="Times New Roman"/>
+                <w:color w:val="auto"/>
+                <w:kern w:val="0"/>
+                <w:szCs w:val="24"/>
+                <w14:ligatures w14:val="none"/>
+              </w:rPr>
+            </w:pPr>
+            <w:r>
+              <w:rPr>
+                <w:rFonts w:eastAsia="Times New Roman"/>
+                <w:color w:val="auto"/>
+                <w:kern w:val="0"/>
+                <w:szCs w:val="24"/>
+                <w14:ligatures w14:val="none"/>
+              </w:rPr>
+              <w:t>8,604</w:t>
+            </w:r>
+          </w:p>
+        </w:tc>
+        <w:tc>
+          <w:tcPr>
+            <w:tcW w:w="0" w:type="auto"/>
+            <w:vAlign w:val="center"/>
+            <w:hideMark/>
+          </w:tcPr>
+          <w:p>
+            <w:pPr>
+              <w:spacing w:before="100" w:beforeAutospacing="1" w:after="100" w:afterAutospacing="1"/>
+              <w:rPr>
+                <w:rFonts w:eastAsia="Times New Roman"/>
+                <w:color w:val="auto"/>
+                <w:kern w:val="0"/>
+                <w:szCs w:val="24"/>
+                <w14:ligatures w14:val="none"/>
+              </w:rPr>
+            </w:pPr>
+            <w:r>
+              <w:rPr>
+                <w:rFonts w:eastAsia="Times New Roman"/>
+                <w:color w:val="auto"/>
+                <w:kern w:val="0"/>
+                <w:szCs w:val="24"/>
+                <w14:ligatures w14:val="none"/>
+              </w:rPr>
+              <w:t>318,671.0</w:t>
+            </w:r>
+          </w:p>
+        </w:tc>
+        <w:tc>
+          <w:tcPr>
+            <w:tcW w:w="0" w:type="auto"/>
+            <w:vAlign w:val="center"/>
+            <w:hideMark/>
+          </w:tcPr>
+          <w:p>
+            <w:pPr>
+              <w:spacing w:before="100" w:beforeAutospacing="1" w:after="100" w:afterAutospacing="1"/>
+              <w:rPr>
+                <w:rFonts w:eastAsia="Times New Roman"/>
+                <w:color w:val="auto"/>
+                <w:kern w:val="0"/>
+                <w:szCs w:val="24"/>
+                <w14:ligatures w14:val="none"/>
+              </w:rPr>
+            </w:pPr>
+            <w:r>
+              <w:rPr>
+                <w:rFonts w:eastAsia="Times New Roman"/>
+                <w:color w:val="auto"/>
+                <w:kern w:val="0"/>
+                <w:szCs w:val="24"/>
+                <w14:ligatures w14:val="none"/>
+              </w:rPr>
+              <w:t>1.1%</w:t>
+            </w:r>
+          </w:p>
+        </w:tc>
+      </w:tr>
+      <w:tr>
+        <w:trPr>
+          <w:tblCellSpacing w:w="15" w:type="dxa"/>
+        </w:trPr>
+        <w:tc>
+          <w:tcPr>
+            <w:tcW w:w="0" w:type="auto"/>
+            <w:vAlign w:val="center"/>
+            <w:hideMark/>
+          </w:tcPr>
+          <w:p>
+            <w:pPr>
+              <w:spacing w:before="100" w:beforeAutospacing="1" w:after="100" w:afterAutospacing="1"/>
+              <w:rPr>
+                <w:rFonts w:eastAsia="Times New Roman"/>
+                <w:color w:val="auto"/>
+                <w:kern w:val="0"/>
+                <w:szCs w:val="24"/>
+                <w14:ligatures w14:val="none"/>
+              </w:rPr>
+            </w:pPr>
+            <w:r>
+              <w:rPr>
+                <w:rFonts w:eastAsia="Times New Roman"/>
+                <w:color w:val="auto"/>
+                <w:kern w:val="0"/>
+                <w:szCs w:val="24"/>
+                <w14:ligatures w14:val="none"/>
+              </w:rPr>
+              <w:t>99</w:t>
+            </w:r>
+          </w:p>
+        </w:tc>
+        <w:tc>
+          <w:tcPr>
+            <w:tcW w:w="0" w:type="auto"/>
+            <w:vAlign w:val="center"/>
+            <w:hideMark/>
+          </w:tcPr>
+          <w:p>
+            <w:pPr>
+              <w:spacing w:before="100" w:beforeAutospacing="1" w:after="100" w:afterAutospacing="1"/>
+              <w:rPr>
+                <w:rFonts w:eastAsia="Times New Roman"/>
+                <w:color w:val="auto"/>
+                <w:kern w:val="0"/>
+                <w:szCs w:val="24"/>
+                <w14:ligatures w14:val="none"/>
+              </w:rPr>
+            </w:pPr>
+            <w:r>
+              <w:rPr>
+                <w:rFonts w:eastAsia="Times New Roman"/>
+                <w:color w:val="auto"/>
+                <w:kern w:val="0"/>
+                <w:szCs w:val="24"/>
+                <w14:ligatures w14:val="none"/>
+              </w:rPr>
               <w:t>Not applicable</w:t>
             </w:r>
           </w:p>
@@ -5076,7 +6734,7 @@
                 <w:szCs w:val="24"/>
                 <w14:ligatures w14:val="none"/>
               </w:rPr>
-              <w:t>157,104</w:t>
+              <w:t>157,131</w:t>
             </w:r>
           </w:p>
         </w:tc>
@@ -5105,7 +6763,36 @@
                 <w:szCs w:val="24"/>
                 <w14:ligatures w14:val="none"/>
               </w:rPr>
-              <w:t>5,818,600.8</w:t>
+              <w:t>5,819,600.8</w:t>
+            </w:r>
+          </w:p>
+        </w:tc>
+        <w:tc>
+          <w:tcPr>
+            <w:tcW w:w="0" w:type="auto"/>
+            <w:vAlign w:val="center"/>
+            <w:hideMark/>
+          </w:tcPr>
+          <w:p>
+            <w:pPr>
+              <w:spacing w:before="100" w:beforeAutospacing="1" w:after="100" w:afterAutospacing="1"/>
+              <w:rPr>
+                <w:rFonts w:eastAsia="Times New Roman"/>
+                <w:color w:val="auto"/>
+                <w:kern w:val="0"/>
+                <w:szCs w:val="24"/>
+                <w14:ligatures w14:val="none"/>
+              </w:rPr>
+            </w:pPr>
+            <w:r>
+              <w:rPr>
+                <w:rFonts w:eastAsia="Times New Roman"/>
+                <w:color w:val="auto"/>
+                <w:kern w:val="0"/>
+                <w:szCs w:val="24"/>
+                <w14:ligatures w14:val="none"/>
+              </w:rPr>
+              <w:t>—</w:t>
             </w:r>
           </w:p>
         </w:tc>
@@ -5128,7 +6815,7 @@
         <w:ind w:left="360"/>
         <w:rPr>
           <w:rFonts w:eastAsia="Times New Roman"/>
-          <w:color w:val="auto"/>
+          <w:color w:val="000000" w:themeColor="text1"/>
           <w:kern w:val="0"/>
           <w:szCs w:val="24"/>
           <w14:ligatures w14:val="none"/>
@@ -5144,6 +6831,7 @@
         </w:rPr>
         <w:t xml:space="preserve">Recoded as: </w:t>
       </w:r>
+      <w:proofErr w:type="spellStart"/>
       <w:r>
         <w:rPr>
           <w:rFonts w:eastAsia="Times New Roman"/>
@@ -5152,7 +6840,82 @@
           <w:szCs w:val="24"/>
           <w14:ligatures w14:val="none"/>
         </w:rPr>
-        <w:t>edu_college</w:t>
+        <w:t>edu_</w:t>
+      </w:r>
+      <w:proofErr w:type="gramStart"/>
+      <w:r>
+        <w:rPr>
+          <w:rFonts w:eastAsia="Times New Roman"/>
+          <w:color w:val="0070C0"/>
+          <w:kern w:val="0"/>
+          <w:szCs w:val="24"/>
+          <w14:ligatures w14:val="none"/>
+        </w:rPr>
+        <w:t>college</w:t>
+      </w:r>
+      <w:proofErr w:type="spellEnd"/>
+      <w:r>
+        <w:rPr>
+          <w:rFonts w:eastAsia="Times New Roman"/>
+          <w:color w:val="0070C0"/>
+          <w:kern w:val="0"/>
+          <w:szCs w:val="24"/>
+          <w14:ligatures w14:val="none"/>
+        </w:rPr>
+        <w:t xml:space="preserve"> </w:t>
+      </w:r>
+      <w:r>
+        <w:rPr>
+          <w:rFonts w:eastAsia="Times New Roman"/>
+          <w:color w:val="000000" w:themeColor="text1"/>
+          <w:kern w:val="0"/>
+          <w:szCs w:val="24"/>
+          <w14:ligatures w14:val="none"/>
+        </w:rPr>
+        <w:t>,</w:t>
+      </w:r>
+      <w:proofErr w:type="gramEnd"/>
+      <w:r>
+        <w:rPr>
+          <w:rFonts w:eastAsia="Times New Roman"/>
+          <w:color w:val="000000" w:themeColor="text1"/>
+          <w:kern w:val="0"/>
+          <w:szCs w:val="24"/>
+          <w14:ligatures w14:val="none"/>
+        </w:rPr>
+        <w:t xml:space="preserve"> </w:t>
+      </w:r>
+      <w:proofErr w:type="spellStart"/>
+      <w:r>
+        <w:rPr>
+          <w:rFonts w:eastAsia="Times New Roman"/>
+          <w:color w:val="000000" w:themeColor="text1"/>
+          <w:kern w:val="0"/>
+          <w:szCs w:val="24"/>
+          <w14:ligatures w14:val="none"/>
+        </w:rPr>
+        <w:t>where as</w:t>
+      </w:r>
+      <w:proofErr w:type="spellEnd"/>
+      <w:r>
+        <w:rPr>
+          <w:rFonts w:eastAsia="Times New Roman"/>
+          <w:color w:val="000000" w:themeColor="text1"/>
+          <w:kern w:val="0"/>
+          <w:szCs w:val="24"/>
+          <w14:ligatures w14:val="none"/>
+        </w:rPr>
+        <w:t xml:space="preserve"> </w:t>
+      </w:r>
+      <w:r>
+        <w:rPr>
+          <w:rFonts w:eastAsia="Times New Roman"/>
+          <w:color w:val="000000" w:themeColor="text1"/>
+          <w:kern w:val="0"/>
+          <w:szCs w:val="24"/>
+          <w14:ligatures w14:val="none"/>
+        </w:rPr>
+        <w:t>(1, 2, 3) are coded as below college and (4~13) are coded as college and above</w:t>
       </w:r>
     </w:p>
     <w:p>
@@ -5855,7 +7618,6 @@
                 <w:szCs w:val="24"/>
                 <w14:ligatures w14:val="none"/>
               </w:rPr>
-              <w:lastRenderedPageBreak/>
               <w:t>13</w:t>
             </w:r>
           </w:p>
@@ -6820,7 +8582,7 @@
         <w:ind w:left="360"/>
         <w:rPr>
           <w:rFonts w:eastAsia="Times New Roman"/>
-          <w:color w:val="auto"/>
+          <w:color w:val="0070C0"/>
           <w:kern w:val="0"/>
           <w:szCs w:val="24"/>
           <w14:ligatures w14:val="none"/>
@@ -6849,8 +8611,95 @@
     </w:p>
     <w:p>
       <w:pPr>
-        <w:ind w:left="425"/>
-        <w:textAlignment w:val="baseline"/>
+        <w:ind w:left="360"/>
+        <w:rPr>
+          <w:rFonts w:eastAsia="Times New Roman"/>
+          <w:color w:val="auto"/>
+          <w:kern w:val="0"/>
+          <w:szCs w:val="24"/>
+          <w14:ligatures w14:val="none"/>
+        </w:rPr>
+      </w:pPr>
+      <w:r>
+        <w:rPr>
+          <w:rFonts w:eastAsia="Times New Roman"/>
+          <w:color w:val="auto"/>
+          <w:kern w:val="0"/>
+          <w:szCs w:val="24"/>
+          <w14:ligatures w14:val="none"/>
+        </w:rPr>
+        <w:t>Provinces in (10, 11, 12, 13) = 1, Atlantic provinces</w:t>
+      </w:r>
+    </w:p>
+    <w:p>
+      <w:pPr>
+        <w:ind w:left="360"/>
+        <w:rPr>
+          <w:rFonts w:eastAsia="Times New Roman"/>
+          <w:color w:val="auto"/>
+          <w:kern w:val="0"/>
+          <w:szCs w:val="24"/>
+          <w14:ligatures w14:val="none"/>
+        </w:rPr>
+      </w:pPr>
+      <w:r>
+        <w:rPr>
+          <w:rFonts w:eastAsia="Times New Roman"/>
+          <w:color w:val="auto"/>
+          <w:kern w:val="0"/>
+          <w:szCs w:val="24"/>
+          <w14:ligatures w14:val="none"/>
+        </w:rPr>
+        <w:t>Provinces in (24, 35) = 2, Central Canada</w:t>
+      </w:r>
+    </w:p>
+    <w:p>
+      <w:pPr>
+        <w:ind w:left="360"/>
+        <w:rPr>
+          <w:rFonts w:eastAsia="Times New Roman"/>
+          <w:color w:val="auto"/>
+          <w:kern w:val="0"/>
+          <w:szCs w:val="24"/>
+          <w14:ligatures w14:val="none"/>
+        </w:rPr>
+      </w:pPr>
+      <w:r>
+        <w:rPr>
+          <w:rFonts w:eastAsia="Times New Roman"/>
+          <w:color w:val="auto"/>
+          <w:kern w:val="0"/>
+          <w:szCs w:val="24"/>
+          <w14:ligatures w14:val="none"/>
+        </w:rPr>
+        <w:t>Provinces in (46, 47, 48) = 3, Prairies</w:t>
+      </w:r>
+    </w:p>
+    <w:p>
+      <w:pPr>
+        <w:ind w:left="360"/>
+        <w:rPr>
+          <w:rFonts w:eastAsia="Times New Roman"/>
+          <w:color w:val="auto"/>
+          <w:kern w:val="0"/>
+          <w:szCs w:val="24"/>
+          <w14:ligatures w14:val="none"/>
+        </w:rPr>
+      </w:pPr>
+      <w:r>
+        <w:rPr>
+          <w:rFonts w:eastAsia="Times New Roman"/>
+          <w:color w:val="auto"/>
+          <w:kern w:val="0"/>
+          <w:szCs w:val="24"/>
+          <w14:ligatures w14:val="none"/>
+        </w:rPr>
+        <w:t>Province in (59) = 4, British Columbia</w:t>
+      </w:r>
+    </w:p>
+    <w:p>
+      <w:pPr>
+        <w:ind w:left="360"/>
         <w:rPr>
           <w:rFonts w:eastAsia="Times New Roman"/>
           <w:color w:val="000000"/>
@@ -6859,6 +8708,16 @@
           <w14:ligatures w14:val="none"/>
         </w:rPr>
       </w:pPr>
+      <w:r>
+        <w:rPr>
+          <w:rFonts w:eastAsia="Times New Roman"/>
+          <w:color w:val="auto"/>
+          <w:kern w:val="0"/>
+          <w:szCs w:val="24"/>
+          <w14:ligatures w14:val="none"/>
+        </w:rPr>
+        <w:t>Province in (70) = 5, Northern Canada</w:t>
+      </w:r>
     </w:p>
     <w:p>
       <w:pPr>
@@ -7246,6 +9105,7 @@
                 <w14:ligatures w14:val="none"/>
               </w:rPr>
             </w:pPr>
+            <w:proofErr w:type="spellStart"/>
             <w:r>
               <w:rPr>
                 <w:rFonts w:ascii="Segoe UI" w:eastAsia="Times New Roman" w:hAnsi="Segoe UI" w:cs="Segoe UI"/>
@@ -7256,7 +9116,20 @@
                 <w:szCs w:val="24"/>
                 <w14:ligatures w14:val="none"/>
               </w:rPr>
-              <w:t>Freqs (% of Valid)</w:t>
+              <w:t>Freqs</w:t>
+            </w:r>
+            <w:proofErr w:type="spellEnd"/>
+            <w:r>
+              <w:rPr>
+                <w:rFonts w:ascii="Segoe UI" w:eastAsia="Times New Roman" w:hAnsi="Segoe UI" w:cs="Segoe UI"/>
+                <w:b/>
+                <w:bCs/>
+                <w:color w:val="212529"/>
+                <w:kern w:val="0"/>
+                <w:szCs w:val="24"/>
+                <w14:ligatures w14:val="none"/>
+              </w:rPr>
+              <w:t xml:space="preserve"> (% of Valid)</w:t>
             </w:r>
           </w:p>
         </w:tc>
@@ -8000,8 +9873,20 @@
                       <w:szCs w:val="24"/>
                       <w14:ligatures w14:val="none"/>
                     </w:rPr>
-                    <w:t>[ 5 others ]</w:t>
+                    <w:t xml:space="preserve">[ 5 </w:t>
                   </w:r>
+                  <w:proofErr w:type="gramStart"/>
+                  <w:r>
+                    <w:rPr>
+                      <w:rFonts w:eastAsia="Times New Roman"/>
+                      <w:color w:val="auto"/>
+                      <w:kern w:val="0"/>
+                      <w:szCs w:val="24"/>
+                      <w14:ligatures w14:val="none"/>
+                    </w:rPr>
+                    <w:t>others ]</w:t>
+                  </w:r>
+                  <w:proofErr w:type="gramEnd"/>
                 </w:p>
               </w:tc>
             </w:tr>
@@ -10136,7 +12021,6 @@
                 <w:szCs w:val="24"/>
                 <w14:ligatures w14:val="none"/>
               </w:rPr>
-              <w:lastRenderedPageBreak/>
               <w:t>2</w:t>
             </w:r>
           </w:p>
@@ -10171,6 +12055,7 @@
                 <w14:ligatures w14:val="none"/>
               </w:rPr>
             </w:pPr>
+            <w:proofErr w:type="spellStart"/>
             <w:r>
               <w:rPr>
                 <w:rFonts w:ascii="Segoe UI" w:eastAsia="Times New Roman" w:hAnsi="Segoe UI" w:cs="Segoe UI"/>
@@ -10181,6 +12066,7 @@
               </w:rPr>
               <w:t>marr</w:t>
             </w:r>
+            <w:proofErr w:type="spellEnd"/>
           </w:p>
           <w:p>
             <w:pPr>
@@ -10977,6 +12863,7 @@
                 <w:szCs w:val="24"/>
                 <w14:ligatures w14:val="none"/>
               </w:rPr>
+              <w:lastRenderedPageBreak/>
               <w:t>3</w:t>
             </w:r>
           </w:p>
@@ -11851,6 +13738,7 @@
                 <w14:ligatures w14:val="none"/>
               </w:rPr>
             </w:pPr>
+            <w:proofErr w:type="spellStart"/>
             <w:r>
               <w:rPr>
                 <w:rFonts w:ascii="Segoe UI" w:eastAsia="Times New Roman" w:hAnsi="Segoe UI" w:cs="Segoe UI"/>
@@ -11861,6 +13749,7 @@
               </w:rPr>
               <w:t>income_q</w:t>
             </w:r>
+            <w:proofErr w:type="spellEnd"/>
           </w:p>
           <w:p>
             <w:pPr>
@@ -14577,6 +16466,7 @@
                 <w14:ligatures w14:val="none"/>
               </w:rPr>
             </w:pPr>
+            <w:proofErr w:type="spellStart"/>
             <w:r>
               <w:rPr>
                 <w:rFonts w:ascii="Segoe UI" w:eastAsia="Times New Roman" w:hAnsi="Segoe UI" w:cs="Segoe UI"/>
@@ -14587,6 +16477,7 @@
               </w:rPr>
               <w:t>edu_college</w:t>
             </w:r>
+            <w:proofErr w:type="spellEnd"/>
           </w:p>
           <w:p>
             <w:pPr>
@@ -15383,7 +17274,6 @@
                 <w:szCs w:val="24"/>
                 <w14:ligatures w14:val="none"/>
               </w:rPr>
-              <w:lastRenderedPageBreak/>
               <w:t>8</w:t>
             </w:r>
           </w:p>
@@ -15690,6 +17580,7 @@
                       <w:szCs w:val="24"/>
                       <w14:ligatures w14:val="none"/>
                     </w:rPr>
+                    <w:lastRenderedPageBreak/>
                     <w:t>5. Northern Canada</w:t>
                   </w:r>
                 </w:p>
@@ -15783,6 +17674,7 @@
                       <w:szCs w:val="24"/>
                       <w14:ligatures w14:val="none"/>
                     </w:rPr>
+                    <w:lastRenderedPageBreak/>
                     <w:t>52707</w:t>
                   </w:r>
                 </w:p>
@@ -16861,7 +18753,7 @@
           <w:szCs w:val="24"/>
         </w:rPr>
         <w:drawing>
-          <wp:inline distT="0" distB="0" distL="0" distR="0" wp14:anchorId="14F6126A" wp14:editId="13825EB1">
+          <wp:inline distT="0" distB="0" distL="0" distR="0" wp14:anchorId="14F6126A" wp14:editId="685ECEC6">
             <wp:extent cx="5943600" cy="4315460"/>
             <wp:effectExtent l="0" t="0" r="0" b="2540"/>
             <wp:docPr id="1465789311" name="Picture 20" descr="A graph with red and blue dots&#10;&#10;AI-generated content may be incorrect."/>
@@ -16916,6 +18808,155 @@
 <file path=word/numbering.xml><?xml version="1.0" encoding="utf-8"?>
 <w:numbering xmlns:wpc="http://schemas.microsoft.com/office/word/2010/wordprocessingCanvas" xmlns:cx="http://schemas.microsoft.com/office/drawing/2014/chartex" xmlns:cx1="http://schemas.microsoft.com/office/drawing/2015/9/8/chartex" xmlns:cx2="http://schemas.microsoft.com/office/drawing/2015/10/21/chartex" xmlns:cx3="http://schemas.microsoft.com/office/drawing/2016/5/9/chartex" xmlns:cx4="http://schemas.microsoft.com/office/drawing/2016/5/10/chartex" xmlns:cx5="http://schemas.microsoft.com/office/drawing/2016/5/11/chartex" xmlns:cx6="http://schemas.microsoft.com/office/drawing/2016/5/12/chartex" xmlns:cx7="http://schemas.microsoft.com/office/drawing/2016/5/13/chartex" xmlns:cx8="http://schemas.microsoft.com/office/drawing/2016/5/14/chartex" xmlns:mc="http://schemas.openxmlformats.org/markup-compatibility/2006" xmlns:aink="http://schemas.microsoft.com/office/drawing/2016/ink" xmlns:am3d="http://schemas.microsoft.com/office/drawing/2017/model3d" xmlns:o="urn:schemas-microsoft-com:office:office" xmlns:oel="http://schemas.microsoft.com/office/2019/extlst" xmlns:r="http://schemas.openxmlformats.org/officeDocument/2006/relationships" xmlns:m="http://schemas.openxmlformats.org/officeDocument/2006/math" xmlns:v="urn:schemas-microsoft-com:vml" xmlns:wp14="http://schemas.microsoft.com/office/word/2010/wordprocessingDrawing" xmlns:wp="http://schemas.openxmlformats.org/drawingml/2006/wordprocessingDrawing" xmlns:w10="urn:schemas-microsoft-com:office:word" xmlns:w="http://schemas.openxmlformats.org/wordprocessingml/2006/main" xmlns:w14="http://schemas.microsoft.com/office/word/2010/wordml" xmlns:w15="http://schemas.microsoft.com/office/word/2012/wordml" xmlns:w16cex="http://schemas.microsoft.com/office/word/2018/wordml/cex" xmlns:w16cid="http://schemas.microsoft.com/office/word/2016/wordml/cid" xmlns:w16="http://schemas.microsoft.com/office/word/2018/wordml" xmlns:w16du="http://schemas.microsoft.com/office/word/2023/wordml/word16du" xmlns:w16sdtdh="http://schemas.microsoft.com/office/word/2020/wordml/sdtdatahash" xmlns:w16sdtfl="http://schemas.microsoft.com/office/word/2024/wordml/sdtformatlock" xmlns:w16se="http://schemas.microsoft.com/office/word/2015/wordml/symex" xmlns:wpg="http://schemas.microsoft.com/office/word/2010/wordprocessingGroup" xmlns:wpi="http://schemas.microsoft.com/office/word/2010/wordprocessingInk" xmlns:wne="http://schemas.microsoft.com/office/word/2006/wordml" xmlns:wps="http://schemas.microsoft.com/office/word/2010/wordprocessingShape" mc:Ignorable="w14 w15 w16se w16cid w16 w16cex w16sdtdh w16sdtfl w16du wp14">
   <w:abstractNum w:abstractNumId="0" w15:restartNumberingAfterBreak="0">
+    <w:nsid w:val="2D4D3098"/>
+    <w:multiLevelType w:val="multilevel"/>
+    <w:tmpl w:val="DC14817E"/>
+    <w:lvl w:ilvl="0">
+      <w:start w:val="1"/>
+      <w:numFmt w:val="bullet"/>
+      <w:lvlText w:val=""/>
+      <w:lvlJc w:val="left"/>
+      <w:pPr>
+        <w:tabs>
+          <w:tab w:val="num" w:pos="720"/>
+        </w:tabs>
+        <w:ind w:left="720" w:hanging="360"/>
+      </w:pPr>
+      <w:rPr>
+        <w:rFonts w:ascii="Symbol" w:hAnsi="Symbol" w:hint="default"/>
+        <w:sz w:val="20"/>
+      </w:rPr>
+    </w:lvl>
+    <w:lvl w:ilvl="1">
+      <w:start w:val="1"/>
+      <w:numFmt w:val="bullet"/>
+      <w:lvlText w:val="o"/>
+      <w:lvlJc w:val="left"/>
+      <w:pPr>
+        <w:tabs>
+          <w:tab w:val="num" w:pos="1440"/>
+        </w:tabs>
+        <w:ind w:left="1440" w:hanging="360"/>
+      </w:pPr>
+      <w:rPr>
+        <w:rFonts w:ascii="Courier New" w:hAnsi="Courier New" w:hint="default"/>
+        <w:sz w:val="20"/>
+      </w:rPr>
+    </w:lvl>
+    <w:lvl w:ilvl="2" w:tentative="1">
+      <w:start w:val="1"/>
+      <w:numFmt w:val="bullet"/>
+      <w:lvlText w:val=""/>
+      <w:lvlJc w:val="left"/>
+      <w:pPr>
+        <w:tabs>
+          <w:tab w:val="num" w:pos="2160"/>
+        </w:tabs>
+        <w:ind w:left="2160" w:hanging="360"/>
+      </w:pPr>
+      <w:rPr>
+        <w:rFonts w:ascii="Wingdings" w:hAnsi="Wingdings" w:hint="default"/>
+        <w:sz w:val="20"/>
+      </w:rPr>
+    </w:lvl>
+    <w:lvl w:ilvl="3" w:tentative="1">
+      <w:start w:val="1"/>
+      <w:numFmt w:val="bullet"/>
+      <w:lvlText w:val=""/>
+      <w:lvlJc w:val="left"/>
+      <w:pPr>
+        <w:tabs>
+          <w:tab w:val="num" w:pos="2880"/>
+        </w:tabs>
+        <w:ind w:left="2880" w:hanging="360"/>
+      </w:pPr>
+      <w:rPr>
+        <w:rFonts w:ascii="Wingdings" w:hAnsi="Wingdings" w:hint="default"/>
+        <w:sz w:val="20"/>
+      </w:rPr>
+    </w:lvl>
+    <w:lvl w:ilvl="4" w:tentative="1">
+      <w:start w:val="1"/>
+      <w:numFmt w:val="bullet"/>
+      <w:lvlText w:val=""/>
+      <w:lvlJc w:val="left"/>
+      <w:pPr>
+        <w:tabs>
+          <w:tab w:val="num" w:pos="3600"/>
+        </w:tabs>
+        <w:ind w:left="3600" w:hanging="360"/>
+      </w:pPr>
+      <w:rPr>
+        <w:rFonts w:ascii="Wingdings" w:hAnsi="Wingdings" w:hint="default"/>
+        <w:sz w:val="20"/>
+      </w:rPr>
+    </w:lvl>
+    <w:lvl w:ilvl="5" w:tentative="1">
+      <w:start w:val="1"/>
+      <w:numFmt w:val="bullet"/>
+      <w:lvlText w:val=""/>
+      <w:lvlJc w:val="left"/>
+      <w:pPr>
+        <w:tabs>
+          <w:tab w:val="num" w:pos="4320"/>
+        </w:tabs>
+        <w:ind w:left="4320" w:hanging="360"/>
+      </w:pPr>
+      <w:rPr>
+        <w:rFonts w:ascii="Wingdings" w:hAnsi="Wingdings" w:hint="default"/>
+        <w:sz w:val="20"/>
+      </w:rPr>
+    </w:lvl>
+    <w:lvl w:ilvl="6" w:tentative="1">
+      <w:start w:val="1"/>
+      <w:numFmt w:val="bullet"/>
+      <w:lvlText w:val=""/>
+      <w:lvlJc w:val="left"/>
+      <w:pPr>
+        <w:tabs>
+          <w:tab w:val="num" w:pos="5040"/>
+        </w:tabs>
+        <w:ind w:left="5040" w:hanging="360"/>
+      </w:pPr>
+      <w:rPr>
+        <w:rFonts w:ascii="Wingdings" w:hAnsi="Wingdings" w:hint="default"/>
+        <w:sz w:val="20"/>
+      </w:rPr>
+    </w:lvl>
+    <w:lvl w:ilvl="7" w:tentative="1">
+      <w:start w:val="1"/>
+      <w:numFmt w:val="bullet"/>
+      <w:lvlText w:val=""/>
+      <w:lvlJc w:val="left"/>
+      <w:pPr>
+        <w:tabs>
+          <w:tab w:val="num" w:pos="5760"/>
+        </w:tabs>
+        <w:ind w:left="5760" w:hanging="360"/>
+      </w:pPr>
+      <w:rPr>
+        <w:rFonts w:ascii="Wingdings" w:hAnsi="Wingdings" w:hint="default"/>
+        <w:sz w:val="20"/>
+      </w:rPr>
+    </w:lvl>
+    <w:lvl w:ilvl="8" w:tentative="1">
+      <w:start w:val="1"/>
+      <w:numFmt w:val="bullet"/>
+      <w:lvlText w:val=""/>
+      <w:lvlJc w:val="left"/>
+      <w:pPr>
+        <w:tabs>
+          <w:tab w:val="num" w:pos="6480"/>
+        </w:tabs>
+        <w:ind w:left="6480" w:hanging="360"/>
+      </w:pPr>
+      <w:rPr>
+        <w:rFonts w:ascii="Wingdings" w:hAnsi="Wingdings" w:hint="default"/>
+        <w:sz w:val="20"/>
+      </w:rPr>
+    </w:lvl>
+  </w:abstractNum>
+  <w:abstractNum w:abstractNumId="1" w15:restartNumberingAfterBreak="0">
     <w:nsid w:val="429104B4"/>
     <w:multiLevelType w:val="multilevel"/>
     <w:tmpl w:val="5D6EA3E4"/>
@@ -17028,7 +19069,7 @@
       </w:pPr>
     </w:lvl>
   </w:abstractNum>
-  <w:abstractNum w:abstractNumId="1" w15:restartNumberingAfterBreak="0">
+  <w:abstractNum w:abstractNumId="2" w15:restartNumberingAfterBreak="0">
     <w:nsid w:val="68F72952"/>
     <w:multiLevelType w:val="multilevel"/>
     <w:tmpl w:val="EBAA7100"/>
@@ -17142,10 +19183,10 @@
     </w:lvl>
   </w:abstractNum>
   <w:num w:numId="1" w16cid:durableId="2009550173">
-    <w:abstractNumId w:val="0"/>
+    <w:abstractNumId w:val="1"/>
   </w:num>
   <w:num w:numId="2" w16cid:durableId="816990805">
-    <w:abstractNumId w:val="0"/>
+    <w:abstractNumId w:val="1"/>
     <w:lvlOverride w:ilvl="1">
       <w:lvl w:ilvl="1">
         <w:numFmt w:val="lowerLetter"/>
@@ -17155,7 +19196,7 @@
     </w:lvlOverride>
   </w:num>
   <w:num w:numId="3" w16cid:durableId="1576042464">
-    <w:abstractNumId w:val="0"/>
+    <w:abstractNumId w:val="1"/>
     <w:lvlOverride w:ilvl="0">
       <w:lvl w:ilvl="0">
         <w:start w:val="1"/>
@@ -17257,7 +19298,7 @@
     </w:lvlOverride>
   </w:num>
   <w:num w:numId="4" w16cid:durableId="312804918">
-    <w:abstractNumId w:val="0"/>
+    <w:abstractNumId w:val="1"/>
     <w:lvlOverride w:ilvl="1">
       <w:lvl w:ilvl="1">
         <w:numFmt w:val="lowerLetter"/>
@@ -17267,7 +19308,7 @@
     </w:lvlOverride>
   </w:num>
   <w:num w:numId="5" w16cid:durableId="1167940000">
-    <w:abstractNumId w:val="1"/>
+    <w:abstractNumId w:val="2"/>
     <w:lvlOverride w:ilvl="0">
       <w:lvl w:ilvl="0">
         <w:numFmt w:val="decimal"/>
@@ -17277,12 +19318,75 @@
     </w:lvlOverride>
   </w:num>
   <w:num w:numId="6" w16cid:durableId="1867064689">
-    <w:abstractNumId w:val="1"/>
+    <w:abstractNumId w:val="2"/>
     <w:lvlOverride w:ilvl="0">
       <w:lvl w:ilvl="0">
         <w:numFmt w:val="decimal"/>
         <w:lvlText w:val="%1."/>
         <w:lvlJc w:val="left"/>
+      </w:lvl>
+    </w:lvlOverride>
+  </w:num>
+  <w:num w:numId="7" w16cid:durableId="614405076">
+    <w:abstractNumId w:val="0"/>
+  </w:num>
+  <w:num w:numId="8" w16cid:durableId="597296981">
+    <w:abstractNumId w:val="0"/>
+    <w:lvlOverride w:ilvl="1">
+      <w:lvl w:ilvl="1">
+        <w:numFmt w:val="bullet"/>
+        <w:lvlText w:val=""/>
+        <w:lvlJc w:val="left"/>
+        <w:pPr>
+          <w:tabs>
+            <w:tab w:val="num" w:pos="1440"/>
+          </w:tabs>
+          <w:ind w:left="1440" w:hanging="360"/>
+        </w:pPr>
+        <w:rPr>
+          <w:rFonts w:ascii="Symbol" w:hAnsi="Symbol" w:hint="default"/>
+          <w:sz w:val="20"/>
+        </w:rPr>
+      </w:lvl>
+    </w:lvlOverride>
+  </w:num>
+  <w:num w:numId="9" w16cid:durableId="647173211">
+    <w:abstractNumId w:val="0"/>
+    <w:lvlOverride w:ilvl="1">
+      <w:lvl w:ilvl="1">
+        <w:numFmt w:val="bullet"/>
+        <w:lvlText w:val=""/>
+        <w:lvlJc w:val="left"/>
+        <w:pPr>
+          <w:tabs>
+            <w:tab w:val="num" w:pos="1440"/>
+          </w:tabs>
+          <w:ind w:left="1440" w:hanging="360"/>
+        </w:pPr>
+        <w:rPr>
+          <w:rFonts w:ascii="Symbol" w:hAnsi="Symbol" w:hint="default"/>
+          <w:sz w:val="20"/>
+        </w:rPr>
+      </w:lvl>
+    </w:lvlOverride>
+  </w:num>
+  <w:num w:numId="10" w16cid:durableId="639963893">
+    <w:abstractNumId w:val="0"/>
+    <w:lvlOverride w:ilvl="1">
+      <w:lvl w:ilvl="1">
+        <w:numFmt w:val="bullet"/>
+        <w:lvlText w:val=""/>
+        <w:lvlJc w:val="left"/>
+        <w:pPr>
+          <w:tabs>
+            <w:tab w:val="num" w:pos="1440"/>
+          </w:tabs>
+          <w:ind w:left="1440" w:hanging="360"/>
+        </w:pPr>
+        <w:rPr>
+          <w:rFonts w:ascii="Symbol" w:hAnsi="Symbol" w:hint="default"/>
+          <w:sz w:val="20"/>
+        </w:rPr>
       </w:lvl>
     </w:lvlOverride>
   </w:num>
@@ -17886,6 +19990,7 @@
   <w:style w:type="character" w:default="1" w:styleId="DefaultParagraphFont">
     <w:name w:val="Default Paragraph Font"/>
     <w:uiPriority w:val="1"/>
+    <w:semiHidden/>
     <w:unhideWhenUsed/>
   </w:style>
   <w:style w:type="table" w:default="1" w:styleId="TableNormal">

</xml_diff>